<commit_message>
Simplify memo price charts
</commit_message>
<xml_diff>
--- a/report/Inca_Polymarket_Submission_Memo.docx
+++ b/report/Inca_Polymarket_Submission_Memo.docx
@@ -1973,7 +1973,7 @@
                 <w:sz w:val="19"/>
                 <w:szCs w:val="19"/>
               </w:rPr>
-              <w:t xml:space="preserve">0.453</w:t>
+              <w:t xml:space="preserve">45.3c</w:t>
             </w:r>
           </w:p>
         </w:tc>
@@ -2009,7 +2009,7 @@
                 <w:sz w:val="19"/>
                 <w:szCs w:val="19"/>
               </w:rPr>
-              <w:t xml:space="preserve">0.112</w:t>
+              <w:t xml:space="preserve">11.2c</w:t>
             </w:r>
           </w:p>
         </w:tc>
@@ -2045,7 +2045,7 @@
                 <w:sz w:val="19"/>
                 <w:szCs w:val="19"/>
               </w:rPr>
-              <w:t xml:space="preserve">0.999</w:t>
+              <w:t xml:space="preserve">99.9c</w:t>
             </w:r>
           </w:p>
         </w:tc>
@@ -2157,7 +2157,7 @@
                 <w:sz w:val="19"/>
                 <w:szCs w:val="19"/>
               </w:rPr>
-              <w:t xml:space="preserve">0.409</w:t>
+              <w:t xml:space="preserve">40.9c</w:t>
             </w:r>
           </w:p>
         </w:tc>
@@ -2194,7 +2194,7 @@
                 <w:sz w:val="19"/>
                 <w:szCs w:val="19"/>
               </w:rPr>
-              <w:t xml:space="preserve">0.110</w:t>
+              <w:t xml:space="preserve">11.0c</w:t>
             </w:r>
           </w:p>
         </w:tc>
@@ -2231,7 +2231,7 @@
                 <w:sz w:val="19"/>
                 <w:szCs w:val="19"/>
               </w:rPr>
-              <w:t xml:space="preserve">0.999</w:t>
+              <w:t xml:space="preserve">99.9c</w:t>
             </w:r>
           </w:p>
         </w:tc>
@@ -2342,7 +2342,7 @@
                 <w:sz w:val="19"/>
                 <w:szCs w:val="19"/>
               </w:rPr>
-              <w:t xml:space="preserve">0.716</w:t>
+              <w:t xml:space="preserve">71.6c</w:t>
             </w:r>
           </w:p>
         </w:tc>
@@ -2378,7 +2378,7 @@
                 <w:sz w:val="19"/>
                 <w:szCs w:val="19"/>
               </w:rPr>
-              <w:t xml:space="preserve">0.497</w:t>
+              <w:t xml:space="preserve">49.7c</w:t>
             </w:r>
           </w:p>
         </w:tc>
@@ -2414,7 +2414,7 @@
                 <w:sz w:val="19"/>
                 <w:szCs w:val="19"/>
               </w:rPr>
-              <w:t xml:space="preserve">0.999</w:t>
+              <w:t xml:space="preserve">99.9c</w:t>
             </w:r>
           </w:p>
         </w:tc>
@@ -2526,7 +2526,7 @@
                 <w:sz w:val="19"/>
                 <w:szCs w:val="19"/>
               </w:rPr>
-              <w:t xml:space="preserve">0.782</w:t>
+              <w:t xml:space="preserve">78.2c</w:t>
             </w:r>
           </w:p>
         </w:tc>
@@ -2563,7 +2563,7 @@
                 <w:sz w:val="19"/>
                 <w:szCs w:val="19"/>
               </w:rPr>
-              <w:t xml:space="preserve">0.500</w:t>
+              <w:t xml:space="preserve">50.0c</w:t>
             </w:r>
           </w:p>
         </w:tc>
@@ -2600,7 +2600,7 @@
                 <w:sz w:val="19"/>
                 <w:szCs w:val="19"/>
               </w:rPr>
-              <w:t xml:space="preserve">0.999</w:t>
+              <w:t xml:space="preserve">99.9c</w:t>
             </w:r>
           </w:p>
         </w:tc>

</xml_diff>

<commit_message>
Remove redundant chart labels
</commit_message>
<xml_diff>
--- a/report/Inca_Polymarket_Submission_Memo.docx
+++ b/report/Inca_Polymarket_Submission_Memo.docx
@@ -1414,7 +1414,7 @@
           <w:sz w:val="19"/>
           <w:szCs w:val="19"/>
         </w:rPr>
-        <w:t xml:space="preserve">The charts mark each wallet's entry window. In all four markets, the contract later moved against the wallet before closing near 1.00 on the side they bought.</w:t>
+        <w:t xml:space="preserve">The charts mark each wallet's entry window. In all four markets, the contract later moved against the wallet before finishing on the side they bought.</w:t>
       </w:r>
     </w:p>
     <w:tbl>
@@ -1458,7 +1458,7 @@
             <w:r>
               <w:drawing>
                 <wp:inline distT="0" distB="0" distL="0" distR="0">
-                  <wp:extent cx="3000375" cy="1295400"/>
+                  <wp:extent cx="3333750" cy="1381125"/>
                   <wp:effectExtent t="0" r="0" b="0" l="0"/>
                   <wp:docPr id="1" name="" descr="" title=""/>
                   <wp:cNvGraphicFramePr>
@@ -1483,7 +1483,7 @@
                         <pic:spPr bwMode="auto">
                           <a:xfrm>
                             <a:off x="0" y="0"/>
-                            <a:ext cx="3000375" cy="1295400"/>
+                            <a:ext cx="3333750" cy="1381125"/>
                           </a:xfrm>
                           <a:prstGeom prst="rect">
                             <a:avLst/>
@@ -1521,7 +1521,7 @@
             <w:r>
               <w:drawing>
                 <wp:inline distT="0" distB="0" distL="0" distR="0">
-                  <wp:extent cx="3000375" cy="1295400"/>
+                  <wp:extent cx="3333750" cy="1381125"/>
                   <wp:effectExtent t="0" r="0" b="0" l="0"/>
                   <wp:docPr id="1" name="" descr="" title=""/>
                   <wp:cNvGraphicFramePr>
@@ -1546,7 +1546,7 @@
                         <pic:spPr bwMode="auto">
                           <a:xfrm>
                             <a:off x="0" y="0"/>
-                            <a:ext cx="3000375" cy="1295400"/>
+                            <a:ext cx="3333750" cy="1381125"/>
                           </a:xfrm>
                           <a:prstGeom prst="rect">
                             <a:avLst/>
@@ -1586,7 +1586,7 @@
             <w:r>
               <w:drawing>
                 <wp:inline distT="0" distB="0" distL="0" distR="0">
-                  <wp:extent cx="3000375" cy="1295400"/>
+                  <wp:extent cx="3333750" cy="1381125"/>
                   <wp:effectExtent t="0" r="0" b="0" l="0"/>
                   <wp:docPr id="1" name="" descr="" title=""/>
                   <wp:cNvGraphicFramePr>
@@ -1611,7 +1611,7 @@
                         <pic:spPr bwMode="auto">
                           <a:xfrm>
                             <a:off x="0" y="0"/>
-                            <a:ext cx="3000375" cy="1295400"/>
+                            <a:ext cx="3333750" cy="1381125"/>
                           </a:xfrm>
                           <a:prstGeom prst="rect">
                             <a:avLst/>
@@ -1649,7 +1649,7 @@
             <w:r>
               <w:drawing>
                 <wp:inline distT="0" distB="0" distL="0" distR="0">
-                  <wp:extent cx="3000375" cy="1295400"/>
+                  <wp:extent cx="3333750" cy="1381125"/>
                   <wp:effectExtent t="0" r="0" b="0" l="0"/>
                   <wp:docPr id="1" name="" descr="" title=""/>
                   <wp:cNvGraphicFramePr>
@@ -1674,7 +1674,7 @@
                         <pic:spPr bwMode="auto">
                           <a:xfrm>
                             <a:off x="0" y="0"/>
-                            <a:ext cx="3000375" cy="1295400"/>
+                            <a:ext cx="3333750" cy="1381125"/>
                           </a:xfrm>
                           <a:prstGeom prst="rect">
                             <a:avLst/>
@@ -1703,11 +1703,10 @@
         </w:tblBorders>
       </w:tblPr>
       <w:tblGrid>
-        <w:gridCol w:w="2700"/>
-        <w:gridCol w:w="1400"/>
-        <w:gridCol w:w="1800"/>
-        <w:gridCol w:w="1900"/>
-        <w:gridCol w:w="2920"/>
+        <w:gridCol w:w="3300"/>
+        <w:gridCol w:w="1700"/>
+        <w:gridCol w:w="2100"/>
+        <w:gridCol w:w="3620"/>
       </w:tblGrid>
       <w:tr>
         <w:trPr>
@@ -1715,7 +1714,7 @@
         </w:trPr>
         <w:tc>
           <w:tcPr>
-            <w:tcW w:type="dxa" w:w="2700"/>
+            <w:tcW w:type="dxa" w:w="3300"/>
             <w:tcBorders>
               <w:top w:val="single" w:color="CBD8D2" w:sz="1"/>
               <w:left w:val="single" w:color="CBD8D2" w:sz="1"/>
@@ -1753,7 +1752,7 @@
         </w:tc>
         <w:tc>
           <w:tcPr>
-            <w:tcW w:type="dxa" w:w="1400"/>
+            <w:tcW w:type="dxa" w:w="1700"/>
             <w:tcBorders>
               <w:top w:val="single" w:color="CBD8D2" w:sz="1"/>
               <w:left w:val="single" w:color="CBD8D2" w:sz="1"/>
@@ -1791,7 +1790,7 @@
         </w:tc>
         <w:tc>
           <w:tcPr>
-            <w:tcW w:type="dxa" w:w="1800"/>
+            <w:tcW w:type="dxa" w:w="2100"/>
             <w:tcBorders>
               <w:top w:val="single" w:color="CBD8D2" w:sz="1"/>
               <w:left w:val="single" w:color="CBD8D2" w:sz="1"/>
@@ -1829,7 +1828,7 @@
         </w:tc>
         <w:tc>
           <w:tcPr>
-            <w:tcW w:type="dxa" w:w="1900"/>
+            <w:tcW w:type="dxa" w:w="3620"/>
             <w:tcBorders>
               <w:top w:val="single" w:color="CBD8D2" w:sz="1"/>
               <w:left w:val="single" w:color="CBD8D2" w:sz="1"/>
@@ -1861,44 +1860,6 @@
                 <w:sz w:val="16"/>
                 <w:szCs w:val="16"/>
               </w:rPr>
-              <w:t xml:space="preserve">Last pre-resolution</w:t>
-            </w:r>
-          </w:p>
-        </w:tc>
-        <w:tc>
-          <w:tcPr>
-            <w:tcW w:type="dxa" w:w="2920"/>
-            <w:tcBorders>
-              <w:top w:val="single" w:color="CBD8D2" w:sz="1"/>
-              <w:left w:val="single" w:color="CBD8D2" w:sz="1"/>
-              <w:bottom w:val="single" w:color="CBD8D2" w:sz="1"/>
-              <w:right w:val="single" w:color="CBD8D2" w:sz="1"/>
-            </w:tcBorders>
-            <w:shd w:fill="DCEBE5" w:val="clear"/>
-            <w:tcMar>
-              <w:top w:type="dxa" w:w="70"/>
-              <w:left w:type="dxa" w:w="95"/>
-              <w:bottom w:type="dxa" w:w="70"/>
-              <w:right w:type="dxa" w:w="95"/>
-            </w:tcMar>
-            <w:vAlign w:val="top"/>
-          </w:tcPr>
-          <w:p>
-            <w:pPr>
-              <w:spacing w:after="0" w:before="0" w:line="252"/>
-              <w:jc w:val="center"/>
-            </w:pPr>
-            <w:r>
-              <w:rPr>
-                <w:rFonts w:ascii="Arial" w:cs="Arial" w:eastAsia="Arial" w:hAnsi="Arial"/>
-                <w:b/>
-                <w:bCs/>
-                <w:i w:val="false"/>
-                <w:iCs w:val="false"/>
-                <w:color w:val="102B24"/>
-                <w:sz w:val="16"/>
-                <w:szCs w:val="16"/>
-              </w:rPr>
               <w:t xml:space="preserve">Won side</w:t>
             </w:r>
           </w:p>
@@ -1907,7 +1868,7 @@
       <w:tr>
         <w:tc>
           <w:tcPr>
-            <w:tcW w:type="dxa" w:w="2700"/>
+            <w:tcW w:type="dxa" w:w="3300"/>
             <w:tcBorders>
               <w:top w:val="single" w:color="CBD8D2" w:sz="1"/>
               <w:left w:val="single" w:color="CBD8D2" w:sz="1"/>
@@ -1943,7 +1904,7 @@
         </w:tc>
         <w:tc>
           <w:tcPr>
-            <w:tcW w:type="dxa" w:w="1400"/>
+            <w:tcW w:type="dxa" w:w="1700"/>
             <w:tcBorders>
               <w:top w:val="single" w:color="CBD8D2" w:sz="1"/>
               <w:left w:val="single" w:color="CBD8D2" w:sz="1"/>
@@ -1979,7 +1940,7 @@
         </w:tc>
         <w:tc>
           <w:tcPr>
-            <w:tcW w:type="dxa" w:w="1800"/>
+            <w:tcW w:type="dxa" w:w="2100"/>
             <w:tcBorders>
               <w:top w:val="single" w:color="CBD8D2" w:sz="1"/>
               <w:left w:val="single" w:color="CBD8D2" w:sz="1"/>
@@ -2015,43 +1976,7 @@
         </w:tc>
         <w:tc>
           <w:tcPr>
-            <w:tcW w:type="dxa" w:w="1900"/>
-            <w:tcBorders>
-              <w:top w:val="single" w:color="CBD8D2" w:sz="1"/>
-              <w:left w:val="single" w:color="CBD8D2" w:sz="1"/>
-              <w:bottom w:val="single" w:color="CBD8D2" w:sz="1"/>
-              <w:right w:val="single" w:color="CBD8D2" w:sz="1"/>
-            </w:tcBorders>
-            <w:tcMar>
-              <w:top w:type="dxa" w:w="70"/>
-              <w:left w:type="dxa" w:w="95"/>
-              <w:bottom w:type="dxa" w:w="70"/>
-              <w:right w:type="dxa" w:w="95"/>
-            </w:tcMar>
-            <w:vAlign w:val="top"/>
-          </w:tcPr>
-          <w:p>
-            <w:pPr>
-              <w:spacing w:after="0" w:before="0" w:line="252"/>
-            </w:pPr>
-            <w:r>
-              <w:rPr>
-                <w:rFonts w:ascii="Arial" w:cs="Arial" w:eastAsia="Arial" w:hAnsi="Arial"/>
-                <w:b w:val="false"/>
-                <w:bCs w:val="false"/>
-                <w:i w:val="false"/>
-                <w:iCs w:val="false"/>
-                <w:color w:val="17201C"/>
-                <w:sz w:val="19"/>
-                <w:szCs w:val="19"/>
-              </w:rPr>
-              <w:t xml:space="preserve">99.9c</w:t>
-            </w:r>
-          </w:p>
-        </w:tc>
-        <w:tc>
-          <w:tcPr>
-            <w:tcW w:type="dxa" w:w="2920"/>
+            <w:tcW w:type="dxa" w:w="3620"/>
             <w:tcBorders>
               <w:top w:val="single" w:color="CBD8D2" w:sz="1"/>
               <w:left w:val="single" w:color="CBD8D2" w:sz="1"/>
@@ -2089,7 +2014,7 @@
       <w:tr>
         <w:tc>
           <w:tcPr>
-            <w:tcW w:type="dxa" w:w="2700"/>
+            <w:tcW w:type="dxa" w:w="3300"/>
             <w:tcBorders>
               <w:top w:val="single" w:color="CBD8D2" w:sz="1"/>
               <w:left w:val="single" w:color="CBD8D2" w:sz="1"/>
@@ -2126,7 +2051,7 @@
         </w:tc>
         <w:tc>
           <w:tcPr>
-            <w:tcW w:type="dxa" w:w="1400"/>
+            <w:tcW w:type="dxa" w:w="1700"/>
             <w:tcBorders>
               <w:top w:val="single" w:color="CBD8D2" w:sz="1"/>
               <w:left w:val="single" w:color="CBD8D2" w:sz="1"/>
@@ -2163,7 +2088,7 @@
         </w:tc>
         <w:tc>
           <w:tcPr>
-            <w:tcW w:type="dxa" w:w="1800"/>
+            <w:tcW w:type="dxa" w:w="2100"/>
             <w:tcBorders>
               <w:top w:val="single" w:color="CBD8D2" w:sz="1"/>
               <w:left w:val="single" w:color="CBD8D2" w:sz="1"/>
@@ -2200,44 +2125,7 @@
         </w:tc>
         <w:tc>
           <w:tcPr>
-            <w:tcW w:type="dxa" w:w="1900"/>
-            <w:tcBorders>
-              <w:top w:val="single" w:color="CBD8D2" w:sz="1"/>
-              <w:left w:val="single" w:color="CBD8D2" w:sz="1"/>
-              <w:bottom w:val="single" w:color="CBD8D2" w:sz="1"/>
-              <w:right w:val="single" w:color="CBD8D2" w:sz="1"/>
-            </w:tcBorders>
-            <w:shd w:fill="F4F7F2" w:val="clear"/>
-            <w:tcMar>
-              <w:top w:type="dxa" w:w="70"/>
-              <w:left w:type="dxa" w:w="95"/>
-              <w:bottom w:type="dxa" w:w="70"/>
-              <w:right w:type="dxa" w:w="95"/>
-            </w:tcMar>
-            <w:vAlign w:val="top"/>
-          </w:tcPr>
-          <w:p>
-            <w:pPr>
-              <w:spacing w:after="0" w:before="0" w:line="252"/>
-            </w:pPr>
-            <w:r>
-              <w:rPr>
-                <w:rFonts w:ascii="Arial" w:cs="Arial" w:eastAsia="Arial" w:hAnsi="Arial"/>
-                <w:b w:val="false"/>
-                <w:bCs w:val="false"/>
-                <w:i w:val="false"/>
-                <w:iCs w:val="false"/>
-                <w:color w:val="17201C"/>
-                <w:sz w:val="19"/>
-                <w:szCs w:val="19"/>
-              </w:rPr>
-              <w:t xml:space="preserve">99.9c</w:t>
-            </w:r>
-          </w:p>
-        </w:tc>
-        <w:tc>
-          <w:tcPr>
-            <w:tcW w:type="dxa" w:w="2920"/>
+            <w:tcW w:type="dxa" w:w="3620"/>
             <w:tcBorders>
               <w:top w:val="single" w:color="CBD8D2" w:sz="1"/>
               <w:left w:val="single" w:color="CBD8D2" w:sz="1"/>
@@ -2276,7 +2164,7 @@
       <w:tr>
         <w:tc>
           <w:tcPr>
-            <w:tcW w:type="dxa" w:w="2700"/>
+            <w:tcW w:type="dxa" w:w="3300"/>
             <w:tcBorders>
               <w:top w:val="single" w:color="CBD8D2" w:sz="1"/>
               <w:left w:val="single" w:color="CBD8D2" w:sz="1"/>
@@ -2312,7 +2200,7 @@
         </w:tc>
         <w:tc>
           <w:tcPr>
-            <w:tcW w:type="dxa" w:w="1400"/>
+            <w:tcW w:type="dxa" w:w="1700"/>
             <w:tcBorders>
               <w:top w:val="single" w:color="CBD8D2" w:sz="1"/>
               <w:left w:val="single" w:color="CBD8D2" w:sz="1"/>
@@ -2348,7 +2236,7 @@
         </w:tc>
         <w:tc>
           <w:tcPr>
-            <w:tcW w:type="dxa" w:w="1800"/>
+            <w:tcW w:type="dxa" w:w="2100"/>
             <w:tcBorders>
               <w:top w:val="single" w:color="CBD8D2" w:sz="1"/>
               <w:left w:val="single" w:color="CBD8D2" w:sz="1"/>
@@ -2384,43 +2272,7 @@
         </w:tc>
         <w:tc>
           <w:tcPr>
-            <w:tcW w:type="dxa" w:w="1900"/>
-            <w:tcBorders>
-              <w:top w:val="single" w:color="CBD8D2" w:sz="1"/>
-              <w:left w:val="single" w:color="CBD8D2" w:sz="1"/>
-              <w:bottom w:val="single" w:color="CBD8D2" w:sz="1"/>
-              <w:right w:val="single" w:color="CBD8D2" w:sz="1"/>
-            </w:tcBorders>
-            <w:tcMar>
-              <w:top w:type="dxa" w:w="70"/>
-              <w:left w:type="dxa" w:w="95"/>
-              <w:bottom w:type="dxa" w:w="70"/>
-              <w:right w:type="dxa" w:w="95"/>
-            </w:tcMar>
-            <w:vAlign w:val="top"/>
-          </w:tcPr>
-          <w:p>
-            <w:pPr>
-              <w:spacing w:after="0" w:before="0" w:line="252"/>
-            </w:pPr>
-            <w:r>
-              <w:rPr>
-                <w:rFonts w:ascii="Arial" w:cs="Arial" w:eastAsia="Arial" w:hAnsi="Arial"/>
-                <w:b w:val="false"/>
-                <w:bCs w:val="false"/>
-                <w:i w:val="false"/>
-                <w:iCs w:val="false"/>
-                <w:color w:val="17201C"/>
-                <w:sz w:val="19"/>
-                <w:szCs w:val="19"/>
-              </w:rPr>
-              <w:t xml:space="preserve">99.9c</w:t>
-            </w:r>
-          </w:p>
-        </w:tc>
-        <w:tc>
-          <w:tcPr>
-            <w:tcW w:type="dxa" w:w="2920"/>
+            <w:tcW w:type="dxa" w:w="3620"/>
             <w:tcBorders>
               <w:top w:val="single" w:color="CBD8D2" w:sz="1"/>
               <w:left w:val="single" w:color="CBD8D2" w:sz="1"/>
@@ -2458,7 +2310,7 @@
       <w:tr>
         <w:tc>
           <w:tcPr>
-            <w:tcW w:type="dxa" w:w="2700"/>
+            <w:tcW w:type="dxa" w:w="3300"/>
             <w:tcBorders>
               <w:top w:val="single" w:color="CBD8D2" w:sz="1"/>
               <w:left w:val="single" w:color="CBD8D2" w:sz="1"/>
@@ -2495,7 +2347,7 @@
         </w:tc>
         <w:tc>
           <w:tcPr>
-            <w:tcW w:type="dxa" w:w="1400"/>
+            <w:tcW w:type="dxa" w:w="1700"/>
             <w:tcBorders>
               <w:top w:val="single" w:color="CBD8D2" w:sz="1"/>
               <w:left w:val="single" w:color="CBD8D2" w:sz="1"/>
@@ -2532,7 +2384,7 @@
         </w:tc>
         <w:tc>
           <w:tcPr>
-            <w:tcW w:type="dxa" w:w="1800"/>
+            <w:tcW w:type="dxa" w:w="2100"/>
             <w:tcBorders>
               <w:top w:val="single" w:color="CBD8D2" w:sz="1"/>
               <w:left w:val="single" w:color="CBD8D2" w:sz="1"/>
@@ -2569,44 +2421,7 @@
         </w:tc>
         <w:tc>
           <w:tcPr>
-            <w:tcW w:type="dxa" w:w="1900"/>
-            <w:tcBorders>
-              <w:top w:val="single" w:color="CBD8D2" w:sz="1"/>
-              <w:left w:val="single" w:color="CBD8D2" w:sz="1"/>
-              <w:bottom w:val="single" w:color="CBD8D2" w:sz="1"/>
-              <w:right w:val="single" w:color="CBD8D2" w:sz="1"/>
-            </w:tcBorders>
-            <w:shd w:fill="F4F7F2" w:val="clear"/>
-            <w:tcMar>
-              <w:top w:type="dxa" w:w="70"/>
-              <w:left w:type="dxa" w:w="95"/>
-              <w:bottom w:type="dxa" w:w="70"/>
-              <w:right w:type="dxa" w:w="95"/>
-            </w:tcMar>
-            <w:vAlign w:val="top"/>
-          </w:tcPr>
-          <w:p>
-            <w:pPr>
-              <w:spacing w:after="0" w:before="0" w:line="252"/>
-            </w:pPr>
-            <w:r>
-              <w:rPr>
-                <w:rFonts w:ascii="Arial" w:cs="Arial" w:eastAsia="Arial" w:hAnsi="Arial"/>
-                <w:b w:val="false"/>
-                <w:bCs w:val="false"/>
-                <w:i w:val="false"/>
-                <w:iCs w:val="false"/>
-                <w:color w:val="17201C"/>
-                <w:sz w:val="19"/>
-                <w:szCs w:val="19"/>
-              </w:rPr>
-              <w:t xml:space="preserve">99.9c</w:t>
-            </w:r>
-          </w:p>
-        </w:tc>
-        <w:tc>
-          <w:tcPr>
-            <w:tcW w:type="dxa" w:w="2920"/>
+            <w:tcW w:type="dxa" w:w="3620"/>
             <w:tcBorders>
               <w:top w:val="single" w:color="CBD8D2" w:sz="1"/>
               <w:left w:val="single" w:color="CBD8D2" w:sz="1"/>

</xml_diff>

<commit_message>
Fix chart label clipping and wallet display
</commit_message>
<xml_diff>
--- a/report/Inca_Polymarket_Submission_Memo.docx
+++ b/report/Inca_Polymarket_Submission_Memo.docx
@@ -167,7 +167,7 @@
           <w:sz w:val="19"/>
           <w:szCs w:val="19"/>
         </w:rPr>
-        <w:t xml:space="preserve"> is the cleanest production-access case: it bought a Beast Games outcome weeks before resolution, when the result may already have been known inside the production chain.</w:t>
+        <w:t xml:space="preserve"> is the clearest production-access case: it bought a Beast Games outcome weeks before resolution, when the result may already have been known inside the production chain.</w:t>
       </w:r>
     </w:p>
     <w:tbl>
@@ -218,7 +218,7 @@
                 <w:sz w:val="19"/>
                 <w:szCs w:val="19"/>
               </w:rPr>
-              <w:t xml:space="preserve">The point is not that these wallets simply won. The stronger pattern is correct-side buying in markets where a specific group could plausibly know the answer earlier than the public.</w:t>
+              <w:t xml:space="preserve">The pattern is not just that these wallets won. It is the combination of correct-side buying, non-obvious prices, and markets where a specific group could plausibly know the answer earlier than the public.</w:t>
             </w:r>
           </w:p>
         </w:tc>
@@ -261,7 +261,7 @@
           <w:sz w:val="19"/>
           <w:szCs w:val="19"/>
         </w:rPr>
-        <w:t xml:space="preserve">The review covered 154 resolved markets, $211.9 million of market lifetime volume, and 205,362 pulled trades. I used a strict ranking screen for the full wallet universe, then a wider triage screen to find candidate rows for manual review.</w:t>
+        <w:t xml:space="preserve">The review covered 154 resolved markets, $211.9 million of market lifetime volume, and 205,362 pulled trades. I used a strict screen for the full wallet universe, then a wider triage screen to find candidate rows for manual review.</w:t>
       </w:r>
     </w:p>
     <w:tbl>
@@ -956,16 +956,43 @@
             <w:r>
               <w:rPr>
                 <w:rFonts w:ascii="Arial" w:cs="Arial" w:eastAsia="Arial" w:hAnsi="Arial"/>
-                <w:b w:val="false"/>
-                <w:bCs w:val="false"/>
-                <w:i w:val="false"/>
-                <w:iCs w:val="false"/>
-                <w:color w:val="17201C"/>
-                <w:sz w:val="19"/>
-                <w:szCs w:val="19"/>
-              </w:rPr>
-              <w:t xml:space="preserve">Kevindoto
-0xcd71fd...0d127</w:t>
+                <w:b/>
+                <w:bCs/>
+                <w:i w:val="false"/>
+                <w:iCs w:val="false"/>
+                <w:color w:val="17201C"/>
+                <w:sz w:val="19"/>
+                <w:szCs w:val="19"/>
+              </w:rPr>
+              <w:t xml:space="preserve">Kevindoto</w:t>
+            </w:r>
+            <w:r>
+              <w:rPr>
+                <w:rFonts w:ascii="Courier New" w:cs="Courier New" w:eastAsia="Courier New" w:hAnsi="Courier New"/>
+                <w:b w:val="false"/>
+                <w:bCs w:val="false"/>
+                <w:i w:val="false"/>
+                <w:iCs w:val="false"/>
+                <w:color w:val="17201C"/>
+                <w:sz w:val="15"/>
+                <w:szCs w:val="15"/>
+              </w:rPr>
+              <w:br/>
+              <w:t xml:space="preserve">0xcd71fd5370880f3d92bb</w:t>
+            </w:r>
+            <w:r>
+              <w:rPr>
+                <w:rFonts w:ascii="Courier New" w:cs="Courier New" w:eastAsia="Courier New" w:hAnsi="Courier New"/>
+                <w:b w:val="false"/>
+                <w:bCs w:val="false"/>
+                <w:i w:val="false"/>
+                <w:iCs w:val="false"/>
+                <w:color w:val="17201C"/>
+                <w:sz w:val="15"/>
+                <w:szCs w:val="15"/>
+              </w:rPr>
+              <w:br/>
+              <w:t xml:space="preserve">941e628c05840fe0d127</w:t>
             </w:r>
           </w:p>
         </w:tc>
@@ -1104,16 +1131,43 @@
             <w:r>
               <w:rPr>
                 <w:rFonts w:ascii="Arial" w:cs="Arial" w:eastAsia="Arial" w:hAnsi="Arial"/>
-                <w:b w:val="false"/>
-                <w:bCs w:val="false"/>
-                <w:i w:val="false"/>
-                <w:iCs w:val="false"/>
-                <w:color w:val="17201C"/>
-                <w:sz w:val="19"/>
-                <w:szCs w:val="19"/>
-              </w:rPr>
-              <w:t xml:space="preserve">AllYourMoniesAreBelongToMe
-0x856484...84b2e</w:t>
+                <w:b/>
+                <w:bCs/>
+                <w:i w:val="false"/>
+                <w:iCs w:val="false"/>
+                <w:color w:val="17201C"/>
+                <w:sz w:val="19"/>
+                <w:szCs w:val="19"/>
+              </w:rPr>
+              <w:t xml:space="preserve">AllYourMoniesAreBelongToMe</w:t>
+            </w:r>
+            <w:r>
+              <w:rPr>
+                <w:rFonts w:ascii="Courier New" w:cs="Courier New" w:eastAsia="Courier New" w:hAnsi="Courier New"/>
+                <w:b w:val="false"/>
+                <w:bCs w:val="false"/>
+                <w:i w:val="false"/>
+                <w:iCs w:val="false"/>
+                <w:color w:val="17201C"/>
+                <w:sz w:val="15"/>
+                <w:szCs w:val="15"/>
+              </w:rPr>
+              <w:br/>
+              <w:t xml:space="preserve">0x8564848285e54c65f6cc</w:t>
+            </w:r>
+            <w:r>
+              <w:rPr>
+                <w:rFonts w:ascii="Courier New" w:cs="Courier New" w:eastAsia="Courier New" w:hAnsi="Courier New"/>
+                <w:b w:val="false"/>
+                <w:bCs w:val="false"/>
+                <w:i w:val="false"/>
+                <w:iCs w:val="false"/>
+                <w:color w:val="17201C"/>
+                <w:sz w:val="15"/>
+                <w:szCs w:val="15"/>
+              </w:rPr>
+              <w:br/>
+              <w:t xml:space="preserve">2e3930b49362fbd84b2e</w:t>
             </w:r>
           </w:p>
         </w:tc>
@@ -1254,16 +1308,43 @@
             <w:r>
               <w:rPr>
                 <w:rFonts w:ascii="Arial" w:cs="Arial" w:eastAsia="Arial" w:hAnsi="Arial"/>
-                <w:b w:val="false"/>
-                <w:bCs w:val="false"/>
-                <w:i w:val="false"/>
-                <w:iCs w:val="false"/>
-                <w:color w:val="17201C"/>
-                <w:sz w:val="19"/>
-                <w:szCs w:val="19"/>
-              </w:rPr>
-              <w:t xml:space="preserve">cookiejar
-0x614ef9...4f1b</w:t>
+                <w:b/>
+                <w:bCs/>
+                <w:i w:val="false"/>
+                <w:iCs w:val="false"/>
+                <w:color w:val="17201C"/>
+                <w:sz w:val="19"/>
+                <w:szCs w:val="19"/>
+              </w:rPr>
+              <w:t xml:space="preserve">cookiejar</w:t>
+            </w:r>
+            <w:r>
+              <w:rPr>
+                <w:rFonts w:ascii="Courier New" w:cs="Courier New" w:eastAsia="Courier New" w:hAnsi="Courier New"/>
+                <w:b w:val="false"/>
+                <w:bCs w:val="false"/>
+                <w:i w:val="false"/>
+                <w:iCs w:val="false"/>
+                <w:color w:val="17201C"/>
+                <w:sz w:val="15"/>
+                <w:szCs w:val="15"/>
+              </w:rPr>
+              <w:br/>
+              <w:t xml:space="preserve">0x614ef98a8be021de3a97</w:t>
+            </w:r>
+            <w:r>
+              <w:rPr>
+                <w:rFonts w:ascii="Courier New" w:cs="Courier New" w:eastAsia="Courier New" w:hAnsi="Courier New"/>
+                <w:b w:val="false"/>
+                <w:bCs w:val="false"/>
+                <w:i w:val="false"/>
+                <w:iCs w:val="false"/>
+                <w:color w:val="17201C"/>
+                <w:sz w:val="15"/>
+                <w:szCs w:val="15"/>
+              </w:rPr>
+              <w:br/>
+              <w:t xml:space="preserve">4942b2fb98794ff34f1b</w:t>
             </w:r>
           </w:p>
         </w:tc>
@@ -1414,7 +1495,7 @@
           <w:sz w:val="19"/>
           <w:szCs w:val="19"/>
         </w:rPr>
-        <w:t xml:space="preserve">The charts mark each wallet's entry window. In all four markets, the contract later moved against the wallet before finishing on the side they bought.</w:t>
+        <w:t xml:space="preserve">The charts mark each wallet's entry window. In all four markets, the contract later moved against the wallet before finishing on the side it bought.</w:t>
       </w:r>
     </w:p>
     <w:tbl>
@@ -1445,9 +1526,9 @@
             </w:tcBorders>
             <w:tcMar>
               <w:top w:type="dxa" w:w="60"/>
-              <w:left w:type="dxa" w:w="40"/>
-              <w:bottom w:type="dxa" w:w="70"/>
-              <w:right w:type="dxa" w:w="40"/>
+              <w:left w:type="dxa" w:w="20"/>
+              <w:bottom w:type="dxa" w:w="70"/>
+              <w:right w:type="dxa" w:w="20"/>
             </w:tcMar>
           </w:tcPr>
           <w:p>
@@ -1458,7 +1539,7 @@
             <w:r>
               <w:drawing>
                 <wp:inline distT="0" distB="0" distL="0" distR="0">
-                  <wp:extent cx="3333750" cy="1381125"/>
+                  <wp:extent cx="3238500" cy="1343025"/>
                   <wp:effectExtent t="0" r="0" b="0" l="0"/>
                   <wp:docPr id="1" name="" descr="" title=""/>
                   <wp:cNvGraphicFramePr>
@@ -1483,7 +1564,7 @@
                         <pic:spPr bwMode="auto">
                           <a:xfrm>
                             <a:off x="0" y="0"/>
-                            <a:ext cx="3333750" cy="1381125"/>
+                            <a:ext cx="3238500" cy="1343025"/>
                           </a:xfrm>
                           <a:prstGeom prst="rect">
                             <a:avLst/>
@@ -1508,9 +1589,9 @@
             </w:tcBorders>
             <w:tcMar>
               <w:top w:type="dxa" w:w="60"/>
-              <w:left w:type="dxa" w:w="40"/>
-              <w:bottom w:type="dxa" w:w="70"/>
-              <w:right w:type="dxa" w:w="40"/>
+              <w:left w:type="dxa" w:w="20"/>
+              <w:bottom w:type="dxa" w:w="70"/>
+              <w:right w:type="dxa" w:w="20"/>
             </w:tcMar>
           </w:tcPr>
           <w:p>
@@ -1521,7 +1602,7 @@
             <w:r>
               <w:drawing>
                 <wp:inline distT="0" distB="0" distL="0" distR="0">
-                  <wp:extent cx="3333750" cy="1381125"/>
+                  <wp:extent cx="3238500" cy="1343025"/>
                   <wp:effectExtent t="0" r="0" b="0" l="0"/>
                   <wp:docPr id="1" name="" descr="" title=""/>
                   <wp:cNvGraphicFramePr>
@@ -1546,7 +1627,7 @@
                         <pic:spPr bwMode="auto">
                           <a:xfrm>
                             <a:off x="0" y="0"/>
-                            <a:ext cx="3333750" cy="1381125"/>
+                            <a:ext cx="3238500" cy="1343025"/>
                           </a:xfrm>
                           <a:prstGeom prst="rect">
                             <a:avLst/>
@@ -1573,9 +1654,9 @@
             </w:tcBorders>
             <w:tcMar>
               <w:top w:type="dxa" w:w="60"/>
-              <w:left w:type="dxa" w:w="40"/>
-              <w:bottom w:type="dxa" w:w="70"/>
-              <w:right w:type="dxa" w:w="40"/>
+              <w:left w:type="dxa" w:w="20"/>
+              <w:bottom w:type="dxa" w:w="70"/>
+              <w:right w:type="dxa" w:w="20"/>
             </w:tcMar>
           </w:tcPr>
           <w:p>
@@ -1586,7 +1667,7 @@
             <w:r>
               <w:drawing>
                 <wp:inline distT="0" distB="0" distL="0" distR="0">
-                  <wp:extent cx="3333750" cy="1381125"/>
+                  <wp:extent cx="3238500" cy="1343025"/>
                   <wp:effectExtent t="0" r="0" b="0" l="0"/>
                   <wp:docPr id="1" name="" descr="" title=""/>
                   <wp:cNvGraphicFramePr>
@@ -1611,7 +1692,7 @@
                         <pic:spPr bwMode="auto">
                           <a:xfrm>
                             <a:off x="0" y="0"/>
-                            <a:ext cx="3333750" cy="1381125"/>
+                            <a:ext cx="3238500" cy="1343025"/>
                           </a:xfrm>
                           <a:prstGeom prst="rect">
                             <a:avLst/>
@@ -1636,9 +1717,9 @@
             </w:tcBorders>
             <w:tcMar>
               <w:top w:type="dxa" w:w="60"/>
-              <w:left w:type="dxa" w:w="40"/>
-              <w:bottom w:type="dxa" w:w="70"/>
-              <w:right w:type="dxa" w:w="40"/>
+              <w:left w:type="dxa" w:w="20"/>
+              <w:bottom w:type="dxa" w:w="70"/>
+              <w:right w:type="dxa" w:w="20"/>
             </w:tcMar>
           </w:tcPr>
           <w:p>
@@ -1649,7 +1730,7 @@
             <w:r>
               <w:drawing>
                 <wp:inline distT="0" distB="0" distL="0" distR="0">
-                  <wp:extent cx="3333750" cy="1381125"/>
+                  <wp:extent cx="3238500" cy="1343025"/>
                   <wp:effectExtent t="0" r="0" b="0" l="0"/>
                   <wp:docPr id="1" name="" descr="" title=""/>
                   <wp:cNvGraphicFramePr>
@@ -1674,7 +1755,7 @@
                         <pic:spPr bwMode="auto">
                           <a:xfrm>
                             <a:off x="0" y="0"/>
-                            <a:ext cx="3333750" cy="1381125"/>
+                            <a:ext cx="3238500" cy="1343025"/>
                           </a:xfrm>
                           <a:prstGeom prst="rect">
                             <a:avLst/>

</xml_diff>

<commit_message>
Swap cookiejar for ScottyNooo; lead score is the authoritative ranking
- Rework lead score: remove hand-pinning, segregate Google controls, add lead_rank
- Profile the actual top-ranked leads (Kevindoto #1, ScottyNooo #2, AllYourMonies #5)
- Pull ScottyNooo Lady Gaga movement + chart; drop cookiejar (#16)
- Memo Task 4 describes the point score + ranked queue; add Spotify-rank cluster note
- Remove personal_learnings/ (PredMonitor IP) from the repo

Co-Authored-By: Claude Opus 4.7 <noreply@anthropic.com>
</commit_message>
<xml_diff>
--- a/report/Inca_Polymarket_Submission_Memo.docx
+++ b/report/Inca_Polymarket_Submission_Memo.docx
@@ -23,7 +23,7 @@
     </w:p>
     <w:p>
       <w:pPr>
-        <w:spacing w:after="90" w:before="0" w:line="252"/>
+        <w:spacing w:after="140" w:before="0" w:line="252"/>
       </w:pPr>
       <w:r>
         <w:rPr>
@@ -54,28 +54,6 @@
     </w:p>
     <w:p>
       <w:pPr>
-        <w:pStyle w:val="Heading2"/>
-        <w:pBdr>
-          <w:bottom w:val="single" w:color="BAD7CE" w:sz="4" w:space="1"/>
-        </w:pBdr>
-        <w:spacing w:after="70" w:before="180"/>
-      </w:pPr>
-      <w:r>
-        <w:rPr>
-          <w:rFonts w:ascii="Arial" w:cs="Arial" w:eastAsia="Arial" w:hAnsi="Arial"/>
-          <w:b/>
-          <w:bCs/>
-          <w:i w:val="false"/>
-          <w:iCs w:val="false"/>
-          <w:color w:val="0F4C3F"/>
-          <w:sz w:val="23"/>
-          <w:szCs w:val="23"/>
-        </w:rPr>
-        <w:t xml:space="preserve">Executive View</w:t>
-      </w:r>
-    </w:p>
-    <w:p>
-      <w:pPr>
         <w:spacing w:after="90" w:before="0" w:line="252"/>
       </w:pPr>
       <w:r>
@@ -89,141 +67,9 @@
           <w:sz w:val="19"/>
           <w:szCs w:val="19"/>
         </w:rPr>
-        <w:t xml:space="preserve">I would submit three wallets for follow-up. </w:t>
-      </w:r>
-      <w:r>
-        <w:rPr>
-          <w:rFonts w:ascii="Arial" w:cs="Arial" w:eastAsia="Arial" w:hAnsi="Arial"/>
-          <w:b/>
-          <w:bCs/>
-          <w:i w:val="false"/>
-          <w:iCs w:val="false"/>
-          <w:color w:val="17201C"/>
-          <w:sz w:val="19"/>
-          <w:szCs w:val="19"/>
-        </w:rPr>
-        <w:t xml:space="preserve">Kevindoto</w:t>
-      </w:r>
-      <w:r>
-        <w:rPr>
-          <w:rFonts w:ascii="Arial" w:cs="Arial" w:eastAsia="Arial" w:hAnsi="Arial"/>
-          <w:b w:val="false"/>
-          <w:bCs w:val="false"/>
-          <w:i w:val="false"/>
-          <w:iCs w:val="false"/>
-          <w:color w:val="17201C"/>
-          <w:sz w:val="19"/>
-          <w:szCs w:val="19"/>
-        </w:rPr>
-        <w:t xml:space="preserve"> is the strongest market-structure case: one wallet bought both sides of the same Spotify ranking thesis, The Weeknd to finish third and Drake not to finish third. </w:t>
-      </w:r>
-      <w:r>
-        <w:rPr>
-          <w:rFonts w:ascii="Arial" w:cs="Arial" w:eastAsia="Arial" w:hAnsi="Arial"/>
-          <w:b/>
-          <w:bCs/>
-          <w:i w:val="false"/>
-          <w:iCs w:val="false"/>
-          <w:color w:val="17201C"/>
-          <w:sz w:val="19"/>
-          <w:szCs w:val="19"/>
-        </w:rPr>
-        <w:t xml:space="preserve">AllYourMoniesAreBelongToMe</w:t>
-      </w:r>
-      <w:r>
-        <w:rPr>
-          <w:rFonts w:ascii="Arial" w:cs="Arial" w:eastAsia="Arial" w:hAnsi="Arial"/>
-          <w:b w:val="false"/>
-          <w:bCs w:val="false"/>
-          <w:i w:val="false"/>
-          <w:iCs w:val="false"/>
-          <w:color w:val="17201C"/>
-          <w:sz w:val="19"/>
-          <w:szCs w:val="19"/>
-        </w:rPr>
-        <w:t xml:space="preserve"> is the clearest size anomaly: the BTS sales bet was roughly 116 times the wallet's prior median trade. </w:t>
-      </w:r>
-      <w:r>
-        <w:rPr>
-          <w:rFonts w:ascii="Arial" w:cs="Arial" w:eastAsia="Arial" w:hAnsi="Arial"/>
-          <w:b/>
-          <w:bCs/>
-          <w:i w:val="false"/>
-          <w:iCs w:val="false"/>
-          <w:color w:val="17201C"/>
-          <w:sz w:val="19"/>
-          <w:szCs w:val="19"/>
-        </w:rPr>
-        <w:t xml:space="preserve">cookiejar</w:t>
-      </w:r>
-      <w:r>
-        <w:rPr>
-          <w:rFonts w:ascii="Arial" w:cs="Arial" w:eastAsia="Arial" w:hAnsi="Arial"/>
-          <w:b w:val="false"/>
-          <w:bCs w:val="false"/>
-          <w:i w:val="false"/>
-          <w:iCs w:val="false"/>
-          <w:color w:val="17201C"/>
-          <w:sz w:val="19"/>
-          <w:szCs w:val="19"/>
-        </w:rPr>
-        <w:t xml:space="preserve"> is the clearest production-access case: it bought a Beast Games outcome weeks before resolution, when the result may already have been known inside the production chain.</w:t>
+        <w:t xml:space="preserve">Three Polymarket wallets made early, correct, oddly specific bets in entertainment markets where a small group could have known the result first. All three are worth attributing.</w:t>
       </w:r>
     </w:p>
-    <w:tbl>
-      <w:tblPr>
-        <w:tblW w:type="dxa" w:w="10720"/>
-        <w:tblBorders>
-          <w:top w:val="single" w:color="auto" w:sz="4"/>
-          <w:left w:val="single" w:color="auto" w:sz="4"/>
-          <w:bottom w:val="single" w:color="auto" w:sz="4"/>
-          <w:right w:val="single" w:color="auto" w:sz="4"/>
-          <w:insideH w:val="single" w:color="auto" w:sz="4"/>
-          <w:insideV w:val="single" w:color="auto" w:sz="4"/>
-        </w:tblBorders>
-      </w:tblPr>
-      <w:tblGrid>
-        <w:gridCol w:w="10720"/>
-      </w:tblGrid>
-      <w:tr>
-        <w:tc>
-          <w:tcPr>
-            <w:tcW w:type="dxa" w:w="10720"/>
-            <w:tcBorders>
-              <w:top w:val="none"/>
-              <w:left w:val="single" w:color="D28B45" w:sz="16"/>
-              <w:bottom w:val="none"/>
-              <w:right w:val="none"/>
-            </w:tcBorders>
-            <w:shd w:fill="FFF3E3" w:val="clear"/>
-            <w:tcMar>
-              <w:top w:type="dxa" w:w="95"/>
-              <w:left w:type="dxa" w:w="140"/>
-              <w:bottom w:type="dxa" w:w="95"/>
-              <w:right w:type="dxa" w:w="110"/>
-            </w:tcMar>
-          </w:tcPr>
-          <w:p>
-            <w:pPr>
-              <w:spacing w:after="0" w:before="0" w:line="252"/>
-            </w:pPr>
-            <w:r>
-              <w:rPr>
-                <w:rFonts w:ascii="Arial" w:cs="Arial" w:eastAsia="Arial" w:hAnsi="Arial"/>
-                <w:b w:val="false"/>
-                <w:bCs w:val="false"/>
-                <w:i w:val="false"/>
-                <w:iCs w:val="false"/>
-                <w:color w:val="17201C"/>
-                <w:sz w:val="19"/>
-                <w:szCs w:val="19"/>
-              </w:rPr>
-              <w:t xml:space="preserve">The pattern is not just that these wallets won. It is the combination of correct-side buying, non-obvious prices, and markets where a specific group could plausibly know the answer earlier than the public.</w:t>
-            </w:r>
-          </w:p>
-        </w:tc>
-      </w:tr>
-    </w:tbl>
     <w:p>
       <w:pPr>
         <w:pStyle w:val="Heading2"/>
@@ -243,7 +89,7 @@
           <w:sz w:val="23"/>
           <w:szCs w:val="23"/>
         </w:rPr>
-        <w:t xml:space="preserve">Screen and Heuristics</w:t>
+        <w:t xml:space="preserve">Task 1 · Data Collection</w:t>
       </w:r>
     </w:p>
     <w:p>
@@ -261,7 +107,47 @@
           <w:sz w:val="19"/>
           <w:szCs w:val="19"/>
         </w:rPr>
-        <w:t xml:space="preserve">The review covered 154 resolved markets, $211.9 million of market lifetime volume, and 205,362 pulled trades. I used a strict screen for the full wallet universe, then a wider triage screen to find candidate rows for manual review.</w:t>
+        <w:t xml:space="preserve">I pulled public Polymarket data end to end: market discovery, every trade in the reviewed markets, wallet activity for wash filtering, and a fresh trade-API pull on the four finalist contracts. The reviewed set is 154 resolved markets, $211.9 million in lifetime volume, 205,362 trades, and 44,607 wallets, all in entertainment and attention markets where one side can know first.</w:t>
+      </w:r>
+    </w:p>
+    <w:p>
+      <w:pPr>
+        <w:pStyle w:val="Heading2"/>
+        <w:pBdr>
+          <w:bottom w:val="single" w:color="BAD7CE" w:sz="4" w:space="1"/>
+        </w:pBdr>
+        <w:spacing w:after="70" w:before="180"/>
+      </w:pPr>
+      <w:r>
+        <w:rPr>
+          <w:rFonts w:ascii="Arial" w:cs="Arial" w:eastAsia="Arial" w:hAnsi="Arial"/>
+          <w:b/>
+          <w:bCs/>
+          <w:i w:val="false"/>
+          <w:iCs w:val="false"/>
+          <w:color w:val="0F4C3F"/>
+          <w:sz w:val="23"/>
+          <w:szCs w:val="23"/>
+        </w:rPr>
+        <w:t xml:space="preserve">Task 2 · Heuristics</w:t>
+      </w:r>
+    </w:p>
+    <w:p>
+      <w:pPr>
+        <w:spacing w:after="90" w:before="0" w:line="252"/>
+      </w:pPr>
+      <w:r>
+        <w:rPr>
+          <w:rFonts w:ascii="Arial" w:cs="Arial" w:eastAsia="Arial" w:hAnsi="Arial"/>
+          <w:b w:val="false"/>
+          <w:bCs w:val="false"/>
+          <w:i w:val="false"/>
+          <w:iCs w:val="false"/>
+          <w:color w:val="17201C"/>
+          <w:sz w:val="19"/>
+          <w:szCs w:val="19"/>
+        </w:rPr>
+        <w:t xml:space="preserve">An explainable screen, not a score you have to trust. A strict pass ranks the full wallet universe; a wider pass surfaces rows for manual review. Three tests do the work.</w:t>
       </w:r>
     </w:p>
     <w:tbl>
@@ -505,7 +391,7 @@
                 <w:sz w:val="19"/>
                 <w:szCs w:val="19"/>
               </w:rPr>
-              <w:t xml:space="preserve">Spotify ranks, album sales, production results.</w:t>
+              <w:t xml:space="preserve">Spotify ranks, album sales, awards voting.</w:t>
             </w:r>
           </w:p>
         </w:tc>
@@ -618,7 +504,7 @@
                 <w:sz w:val="19"/>
                 <w:szCs w:val="19"/>
               </w:rPr>
-              <w:t xml:space="preserve">Selected positions averaged 40.9c to 78.2c.</w:t>
+              <w:t xml:space="preserve">Selected positions averaged 40.9c to 71.6c.</w:t>
             </w:r>
           </w:p>
         </w:tc>
@@ -728,7 +614,7 @@
                 <w:sz w:val="19"/>
                 <w:szCs w:val="19"/>
               </w:rPr>
-              <w:t xml:space="preserve">Paired Spotify view, 116x prior median size, early production-result bet.</w:t>
+              <w:t xml:space="preserve">Paired Spotify view, a 116x size jump, and an early awards bet.</w:t>
             </w:r>
           </w:p>
         </w:tc>
@@ -753,7 +639,25 @@
           <w:sz w:val="23"/>
           <w:szCs w:val="23"/>
         </w:rPr>
-        <w:t xml:space="preserve">Candidate Detail</w:t>
+        <w:t xml:space="preserve">Task 3 · Findings: Candidate Detail</w:t>
+      </w:r>
+    </w:p>
+    <w:p>
+      <w:pPr>
+        <w:spacing w:after="90" w:before="0" w:line="252"/>
+      </w:pPr>
+      <w:r>
+        <w:rPr>
+          <w:rFonts w:ascii="Arial" w:cs="Arial" w:eastAsia="Arial" w:hAnsi="Arial"/>
+          <w:b w:val="false"/>
+          <w:bCs w:val="false"/>
+          <w:i w:val="false"/>
+          <w:iCs w:val="false"/>
+          <w:color w:val="17201C"/>
+          <w:sz w:val="19"/>
+          <w:szCs w:val="19"/>
+        </w:rPr>
+        <w:t xml:space="preserve">Reviewing the strongest rows by hand leaves three wallets and four positions.</w:t>
       </w:r>
     </w:p>
     <w:tbl>
@@ -770,9 +674,9 @@
       </w:tblPr>
       <w:tblGrid>
         <w:gridCol w:w="2550"/>
-        <w:gridCol w:w="3150"/>
-        <w:gridCol w:w="2300"/>
-        <w:gridCol w:w="2720"/>
+        <w:gridCol w:w="3550"/>
+        <w:gridCol w:w="2400"/>
+        <w:gridCol w:w="2220"/>
       </w:tblGrid>
       <w:tr>
         <w:trPr>
@@ -818,7 +722,7 @@
         </w:tc>
         <w:tc>
           <w:tcPr>
-            <w:tcW w:type="dxa" w:w="3150"/>
+            <w:tcW w:type="dxa" w:w="3550"/>
             <w:tcBorders>
               <w:top w:val="single" w:color="CBD8D2" w:sz="1"/>
               <w:left w:val="single" w:color="CBD8D2" w:sz="1"/>
@@ -856,7 +760,7 @@
         </w:tc>
         <w:tc>
           <w:tcPr>
-            <w:tcW w:type="dxa" w:w="2300"/>
+            <w:tcW w:type="dxa" w:w="2400"/>
             <w:tcBorders>
               <w:top w:val="single" w:color="CBD8D2" w:sz="1"/>
               <w:left w:val="single" w:color="CBD8D2" w:sz="1"/>
@@ -894,7 +798,7 @@
         </w:tc>
         <w:tc>
           <w:tcPr>
-            <w:tcW w:type="dxa" w:w="2720"/>
+            <w:tcW w:type="dxa" w:w="2220"/>
             <w:tcBorders>
               <w:top w:val="single" w:color="CBD8D2" w:sz="1"/>
               <w:left w:val="single" w:color="CBD8D2" w:sz="1"/>
@@ -926,7 +830,7 @@
                 <w:sz w:val="16"/>
                 <w:szCs w:val="16"/>
               </w:rPr>
-              <w:t xml:space="preserve">Insider-style read</w:t>
+              <w:t xml:space="preserve">Lead time</w:t>
             </w:r>
           </w:p>
         </w:tc>
@@ -998,7 +902,7 @@
         </w:tc>
         <w:tc>
           <w:tcPr>
-            <w:tcW w:type="dxa" w:w="3150"/>
+            <w:tcW w:type="dxa" w:w="3550"/>
             <w:tcBorders>
               <w:top w:val="single" w:color="CBD8D2" w:sz="1"/>
               <w:left w:val="single" w:color="CBD8D2" w:sz="1"/>
@@ -1034,7 +938,7 @@
         </w:tc>
         <w:tc>
           <w:tcPr>
-            <w:tcW w:type="dxa" w:w="2300"/>
+            <w:tcW w:type="dxa" w:w="2400"/>
             <w:tcBorders>
               <w:top w:val="single" w:color="CBD8D2" w:sz="1"/>
               <w:left w:val="single" w:color="CBD8D2" w:sz="1"/>
@@ -1070,37 +974,37 @@
         </w:tc>
         <w:tc>
           <w:tcPr>
-            <w:tcW w:type="dxa" w:w="2720"/>
-            <w:tcBorders>
-              <w:top w:val="single" w:color="CBD8D2" w:sz="1"/>
-              <w:left w:val="single" w:color="CBD8D2" w:sz="1"/>
-              <w:bottom w:val="single" w:color="CBD8D2" w:sz="1"/>
-              <w:right w:val="single" w:color="CBD8D2" w:sz="1"/>
-            </w:tcBorders>
-            <w:tcMar>
-              <w:top w:type="dxa" w:w="70"/>
-              <w:left w:type="dxa" w:w="95"/>
-              <w:bottom w:type="dxa" w:w="70"/>
-              <w:right w:type="dxa" w:w="95"/>
-            </w:tcMar>
-            <w:vAlign w:val="top"/>
-          </w:tcPr>
-          <w:p>
-            <w:pPr>
-              <w:spacing w:after="0" w:before="0" w:line="252"/>
-            </w:pPr>
-            <w:r>
-              <w:rPr>
-                <w:rFonts w:ascii="Arial" w:cs="Arial" w:eastAsia="Arial" w:hAnsi="Arial"/>
-                <w:b w:val="false"/>
-                <w:bCs w:val="false"/>
-                <w:i w:val="false"/>
-                <w:iCs w:val="false"/>
-                <w:color w:val="17201C"/>
-                <w:sz w:val="19"/>
-                <w:szCs w:val="19"/>
-              </w:rPr>
-              <w:t xml:space="preserve">A paired ranking view that points to platform, label, or distributor data.</w:t>
+            <w:tcW w:type="dxa" w:w="2220"/>
+            <w:tcBorders>
+              <w:top w:val="single" w:color="CBD8D2" w:sz="1"/>
+              <w:left w:val="single" w:color="CBD8D2" w:sz="1"/>
+              <w:bottom w:val="single" w:color="CBD8D2" w:sz="1"/>
+              <w:right w:val="single" w:color="CBD8D2" w:sz="1"/>
+            </w:tcBorders>
+            <w:tcMar>
+              <w:top w:type="dxa" w:w="70"/>
+              <w:left w:type="dxa" w:w="95"/>
+              <w:bottom w:type="dxa" w:w="70"/>
+              <w:right w:type="dxa" w:w="95"/>
+            </w:tcMar>
+            <w:vAlign w:val="top"/>
+          </w:tcPr>
+          <w:p>
+            <w:pPr>
+              <w:spacing w:after="0" w:before="0" w:line="252"/>
+            </w:pPr>
+            <w:r>
+              <w:rPr>
+                <w:rFonts w:ascii="Arial" w:cs="Arial" w:eastAsia="Arial" w:hAnsi="Arial"/>
+                <w:b w:val="false"/>
+                <w:bCs w:val="false"/>
+                <w:i w:val="false"/>
+                <w:iCs w:val="false"/>
+                <w:color w:val="17201C"/>
+                <w:sz w:val="19"/>
+                <w:szCs w:val="19"/>
+              </w:rPr>
+              <w:t xml:space="preserve">~1-2 days before close</w:t>
             </w:r>
           </w:p>
         </w:tc>
@@ -1173,7 +1077,7 @@
         </w:tc>
         <w:tc>
           <w:tcPr>
-            <w:tcW w:type="dxa" w:w="3150"/>
+            <w:tcW w:type="dxa" w:w="3550"/>
             <w:tcBorders>
               <w:top w:val="single" w:color="CBD8D2" w:sz="1"/>
               <w:left w:val="single" w:color="CBD8D2" w:sz="1"/>
@@ -1210,7 +1114,7 @@
         </w:tc>
         <w:tc>
           <w:tcPr>
-            <w:tcW w:type="dxa" w:w="2300"/>
+            <w:tcW w:type="dxa" w:w="2400"/>
             <w:tcBorders>
               <w:top w:val="single" w:color="CBD8D2" w:sz="1"/>
               <w:left w:val="single" w:color="CBD8D2" w:sz="1"/>
@@ -1247,7 +1151,7 @@
         </w:tc>
         <w:tc>
           <w:tcPr>
-            <w:tcW w:type="dxa" w:w="2720"/>
+            <w:tcW w:type="dxa" w:w="2220"/>
             <w:tcBorders>
               <w:top w:val="single" w:color="CBD8D2" w:sz="1"/>
               <w:left w:val="single" w:color="CBD8D2" w:sz="1"/>
@@ -1278,7 +1182,7 @@
                 <w:sz w:val="19"/>
                 <w:szCs w:val="19"/>
               </w:rPr>
-              <w:t xml:space="preserve">A sales-threshold bet far above the wallet's normal trade size.</w:t>
+              <w:t xml:space="preserve">42-49 days before close</w:t>
             </w:r>
           </w:p>
         </w:tc>
@@ -1316,7 +1220,7 @@
                 <w:sz w:val="19"/>
                 <w:szCs w:val="19"/>
               </w:rPr>
-              <w:t xml:space="preserve">cookiejar</w:t>
+              <w:t xml:space="preserve">ScottyNooo</w:t>
             </w:r>
             <w:r>
               <w:rPr>
@@ -1330,7 +1234,7 @@
                 <w:szCs w:val="15"/>
               </w:rPr>
               <w:br/>
-              <w:t xml:space="preserve">0x614ef98a8be021de3a97</w:t>
+              <w:t xml:space="preserve">0xbacd00c9080a82ded56f</w:t>
             </w:r>
             <w:r>
               <w:rPr>
@@ -1344,115 +1248,115 @@
                 <w:szCs w:val="15"/>
               </w:rPr>
               <w:br/>
-              <w:t xml:space="preserve">4942b2fb98794ff34f1b</w:t>
-            </w:r>
-          </w:p>
-        </w:tc>
-        <w:tc>
-          <w:tcPr>
-            <w:tcW w:type="dxa" w:w="3150"/>
-            <w:tcBorders>
-              <w:top w:val="single" w:color="CBD8D2" w:sz="1"/>
-              <w:left w:val="single" w:color="CBD8D2" w:sz="1"/>
-              <w:bottom w:val="single" w:color="CBD8D2" w:sz="1"/>
-              <w:right w:val="single" w:color="CBD8D2" w:sz="1"/>
-            </w:tcBorders>
-            <w:tcMar>
-              <w:top w:type="dxa" w:w="70"/>
-              <w:left w:type="dxa" w:w="95"/>
-              <w:bottom w:type="dxa" w:w="70"/>
-              <w:right w:type="dxa" w:w="95"/>
-            </w:tcMar>
-            <w:vAlign w:val="top"/>
-          </w:tcPr>
-          <w:p>
-            <w:pPr>
-              <w:spacing w:after="0" w:before="0" w:line="252"/>
-            </w:pPr>
-            <w:r>
-              <w:rPr>
-                <w:rFonts w:ascii="Arial" w:cs="Arial" w:eastAsia="Arial" w:hAnsi="Arial"/>
-                <w:b w:val="false"/>
-                <w:bCs w:val="false"/>
-                <w:i w:val="false"/>
-                <w:iCs w:val="false"/>
-                <w:color w:val="17201C"/>
-                <w:sz w:val="19"/>
-                <w:szCs w:val="19"/>
-              </w:rPr>
-              <w:t xml:space="preserve">Beast Games contestant 151-175 wins</w:t>
-            </w:r>
-          </w:p>
-        </w:tc>
-        <w:tc>
-          <w:tcPr>
-            <w:tcW w:type="dxa" w:w="2300"/>
-            <w:tcBorders>
-              <w:top w:val="single" w:color="CBD8D2" w:sz="1"/>
-              <w:left w:val="single" w:color="CBD8D2" w:sz="1"/>
-              <w:bottom w:val="single" w:color="CBD8D2" w:sz="1"/>
-              <w:right w:val="single" w:color="CBD8D2" w:sz="1"/>
-            </w:tcBorders>
-            <w:tcMar>
-              <w:top w:type="dxa" w:w="70"/>
-              <w:left w:type="dxa" w:w="95"/>
-              <w:bottom w:type="dxa" w:w="70"/>
-              <w:right w:type="dxa" w:w="95"/>
-            </w:tcMar>
-            <w:vAlign w:val="top"/>
-          </w:tcPr>
-          <w:p>
-            <w:pPr>
-              <w:spacing w:after="0" w:before="0" w:line="252"/>
-            </w:pPr>
-            <w:r>
-              <w:rPr>
-                <w:rFonts w:ascii="Arial" w:cs="Arial" w:eastAsia="Arial" w:hAnsi="Arial"/>
-                <w:b w:val="false"/>
-                <w:bCs w:val="false"/>
-                <w:i w:val="false"/>
-                <w:iCs w:val="false"/>
-                <w:color w:val="17201C"/>
-                <w:sz w:val="19"/>
-                <w:szCs w:val="19"/>
-              </w:rPr>
-              <w:t xml:space="preserve">$5.8k YES at 78.2c average</w:t>
-            </w:r>
-          </w:p>
-        </w:tc>
-        <w:tc>
-          <w:tcPr>
-            <w:tcW w:type="dxa" w:w="2720"/>
-            <w:tcBorders>
-              <w:top w:val="single" w:color="CBD8D2" w:sz="1"/>
-              <w:left w:val="single" w:color="CBD8D2" w:sz="1"/>
-              <w:bottom w:val="single" w:color="CBD8D2" w:sz="1"/>
-              <w:right w:val="single" w:color="CBD8D2" w:sz="1"/>
-            </w:tcBorders>
-            <w:tcMar>
-              <w:top w:type="dxa" w:w="70"/>
-              <w:left w:type="dxa" w:w="95"/>
-              <w:bottom w:type="dxa" w:w="70"/>
-              <w:right w:type="dxa" w:w="95"/>
-            </w:tcMar>
-            <w:vAlign w:val="top"/>
-          </w:tcPr>
-          <w:p>
-            <w:pPr>
-              <w:spacing w:after="0" w:before="0" w:line="252"/>
-            </w:pPr>
-            <w:r>
-              <w:rPr>
-                <w:rFonts w:ascii="Arial" w:cs="Arial" w:eastAsia="Arial" w:hAnsi="Arial"/>
-                <w:b w:val="false"/>
-                <w:bCs w:val="false"/>
-                <w:i w:val="false"/>
-                <w:iCs w:val="false"/>
-                <w:color w:val="17201C"/>
-                <w:sz w:val="19"/>
-                <w:szCs w:val="19"/>
-              </w:rPr>
-              <w:t xml:space="preserve">A production-result market where the answer may have been known before airing.</w:t>
+              <w:t xml:space="preserve">504ee8810af732b0ab35</w:t>
+            </w:r>
+          </w:p>
+        </w:tc>
+        <w:tc>
+          <w:tcPr>
+            <w:tcW w:type="dxa" w:w="3550"/>
+            <w:tcBorders>
+              <w:top w:val="single" w:color="CBD8D2" w:sz="1"/>
+              <w:left w:val="single" w:color="CBD8D2" w:sz="1"/>
+              <w:bottom w:val="single" w:color="CBD8D2" w:sz="1"/>
+              <w:right w:val="single" w:color="CBD8D2" w:sz="1"/>
+            </w:tcBorders>
+            <w:tcMar>
+              <w:top w:type="dxa" w:w="70"/>
+              <w:left w:type="dxa" w:w="95"/>
+              <w:bottom w:type="dxa" w:w="70"/>
+              <w:right w:type="dxa" w:w="95"/>
+            </w:tcMar>
+            <w:vAlign w:val="top"/>
+          </w:tcPr>
+          <w:p>
+            <w:pPr>
+              <w:spacing w:after="0" w:before="0" w:line="252"/>
+            </w:pPr>
+            <w:r>
+              <w:rPr>
+                <w:rFonts w:ascii="Arial" w:cs="Arial" w:eastAsia="Arial" w:hAnsi="Arial"/>
+                <w:b w:val="false"/>
+                <w:bCs w:val="false"/>
+                <w:i w:val="false"/>
+                <w:iCs w:val="false"/>
+                <w:color w:val="17201C"/>
+                <w:sz w:val="19"/>
+                <w:szCs w:val="19"/>
+              </w:rPr>
+              <w:t xml:space="preserve">Lady Gaga to win 3 Grammys — bought NO</w:t>
+            </w:r>
+          </w:p>
+        </w:tc>
+        <w:tc>
+          <w:tcPr>
+            <w:tcW w:type="dxa" w:w="2400"/>
+            <w:tcBorders>
+              <w:top w:val="single" w:color="CBD8D2" w:sz="1"/>
+              <w:left w:val="single" w:color="CBD8D2" w:sz="1"/>
+              <w:bottom w:val="single" w:color="CBD8D2" w:sz="1"/>
+              <w:right w:val="single" w:color="CBD8D2" w:sz="1"/>
+            </w:tcBorders>
+            <w:tcMar>
+              <w:top w:type="dxa" w:w="70"/>
+              <w:left w:type="dxa" w:w="95"/>
+              <w:bottom w:type="dxa" w:w="70"/>
+              <w:right w:type="dxa" w:w="95"/>
+            </w:tcMar>
+            <w:vAlign w:val="top"/>
+          </w:tcPr>
+          <w:p>
+            <w:pPr>
+              <w:spacing w:after="0" w:before="0" w:line="252"/>
+            </w:pPr>
+            <w:r>
+              <w:rPr>
+                <w:rFonts w:ascii="Arial" w:cs="Arial" w:eastAsia="Arial" w:hAnsi="Arial"/>
+                <w:b w:val="false"/>
+                <w:bCs w:val="false"/>
+                <w:i w:val="false"/>
+                <w:iCs w:val="false"/>
+                <w:color w:val="17201C"/>
+                <w:sz w:val="19"/>
+                <w:szCs w:val="19"/>
+              </w:rPr>
+              <w:t xml:space="preserve">$9.2k NO at 43.2c average</w:t>
+            </w:r>
+          </w:p>
+        </w:tc>
+        <w:tc>
+          <w:tcPr>
+            <w:tcW w:type="dxa" w:w="2220"/>
+            <w:tcBorders>
+              <w:top w:val="single" w:color="CBD8D2" w:sz="1"/>
+              <w:left w:val="single" w:color="CBD8D2" w:sz="1"/>
+              <w:bottom w:val="single" w:color="CBD8D2" w:sz="1"/>
+              <w:right w:val="single" w:color="CBD8D2" w:sz="1"/>
+            </w:tcBorders>
+            <w:tcMar>
+              <w:top w:type="dxa" w:w="70"/>
+              <w:left w:type="dxa" w:w="95"/>
+              <w:bottom w:type="dxa" w:w="70"/>
+              <w:right w:type="dxa" w:w="95"/>
+            </w:tcMar>
+            <w:vAlign w:val="top"/>
+          </w:tcPr>
+          <w:p>
+            <w:pPr>
+              <w:spacing w:after="0" w:before="0" w:line="252"/>
+            </w:pPr>
+            <w:r>
+              <w:rPr>
+                <w:rFonts w:ascii="Arial" w:cs="Arial" w:eastAsia="Arial" w:hAnsi="Arial"/>
+                <w:b w:val="false"/>
+                <w:bCs w:val="false"/>
+                <w:i w:val="false"/>
+                <w:iCs w:val="false"/>
+                <w:color w:val="17201C"/>
+                <w:sz w:val="19"/>
+                <w:szCs w:val="19"/>
+              </w:rPr>
+              <w:t xml:space="preserve">~4 days before close</w:t>
             </w:r>
           </w:p>
         </w:tc>
@@ -1477,7 +1381,7 @@
           <w:sz w:val="23"/>
           <w:szCs w:val="23"/>
         </w:rPr>
-        <w:t xml:space="preserve">Entry Timing and Contract Movement</w:t>
+        <w:t xml:space="preserve">Task 3 · Entry Timing and Contract Movement</w:t>
       </w:r>
     </w:p>
     <w:p>
@@ -1495,7 +1399,7 @@
           <w:sz w:val="19"/>
           <w:szCs w:val="19"/>
         </w:rPr>
-        <w:t xml:space="preserve">The charts mark each wallet's entry window. In all four markets, the contract later moved against the wallet before finishing on the side it bought.</w:t>
+        <w:t xml:space="preserve">The shaded band marks each wallet's buying window against the full price path. Every contract moved against the wallet after entry, then settled on the side it bought, so none of these were last-minute sweeps.</w:t>
       </w:r>
     </w:p>
     <w:tbl>
@@ -2422,7 +2326,7 @@
                 <w:sz w:val="19"/>
                 <w:szCs w:val="19"/>
               </w:rPr>
-              <w:t xml:space="preserve">Beast Games 151-175</w:t>
+              <w:t xml:space="preserve">Lady Gaga 3 Grammys</w:t>
             </w:r>
           </w:p>
         </w:tc>
@@ -2459,7 +2363,7 @@
                 <w:sz w:val="19"/>
                 <w:szCs w:val="19"/>
               </w:rPr>
-              <w:t xml:space="preserve">78.2c</w:t>
+              <w:t xml:space="preserve">43.2c</w:t>
             </w:r>
           </w:p>
         </w:tc>
@@ -2496,7 +2400,7 @@
                 <w:sz w:val="19"/>
                 <w:szCs w:val="19"/>
               </w:rPr>
-              <w:t xml:space="preserve">50.0c</w:t>
+              <w:t xml:space="preserve">12.2c</w:t>
             </w:r>
           </w:p>
         </w:tc>
@@ -2533,7 +2437,7 @@
                 <w:sz w:val="19"/>
                 <w:szCs w:val="19"/>
               </w:rPr>
-              <w:t xml:space="preserve">YES</w:t>
+              <w:t xml:space="preserve">NO</w:t>
             </w:r>
           </w:p>
         </w:tc>
@@ -2576,9 +2480,189 @@
           <w:sz w:val="19"/>
           <w:szCs w:val="19"/>
         </w:rPr>
-        <w:t xml:space="preserve">The $3,000 to $5,000 notional range is not too low for this assignment. A pure whale filter would miss quieter insider-style behavior. The more useful signal is the bundle: knowable-by-few market, non-obvious price, unusual wallet behavior, and price action that later confirms the position.</w:t>
+        <w:t xml:space="preserve">The throughline is the market, not the trader. Each bet rests on a public guess about something a small group already had in hand: a year-end streaming rank, a first-week sales number, an awards result the people who vote on it can sense before the show.</w:t>
       </w:r>
     </w:p>
+    <w:p>
+      <w:pPr>
+        <w:pStyle w:val="ListParagraph"/>
+        <w:numPr>
+          <w:ilvl w:val="0"/>
+          <w:numId w:val="2"/>
+        </w:numPr>
+        <w:spacing w:after="120" w:before="0" w:line="256"/>
+      </w:pPr>
+      <w:r>
+        <w:rPr>
+          <w:rFonts w:ascii="Arial" w:cs="Arial" w:eastAsia="Arial" w:hAnsi="Arial"/>
+          <w:b/>
+          <w:bCs/>
+          <w:i w:val="false"/>
+          <w:iCs w:val="false"/>
+          <w:color w:val="17201C"/>
+          <w:sz w:val="19"/>
+          <w:szCs w:val="19"/>
+        </w:rPr>
+        <w:t xml:space="preserve">Kevindoto </w:t>
+      </w:r>
+      <w:r>
+        <w:rPr>
+          <w:rFonts w:ascii="Arial" w:cs="Arial" w:eastAsia="Arial" w:hAnsi="Arial"/>
+          <w:b w:val="false"/>
+          <w:bCs w:val="false"/>
+          <w:i w:val="false"/>
+          <w:iCs w:val="false"/>
+          <w:color w:val="17201C"/>
+          <w:sz w:val="19"/>
+          <w:szCs w:val="19"/>
+        </w:rPr>
+        <w:t xml:space="preserve">bought The Weeknd YES and Drake NO in the same year-end ranking, $16.1k at 43.8c blended, and held from a dip to 11c through resolution. Betting both legs means knowing the order of finish, not one artist, which narrows the source to a full-ranking vantage point like a platform or label seat, not a tip about a single name.</w:t>
+      </w:r>
+    </w:p>
+    <w:p>
+      <w:pPr>
+        <w:pStyle w:val="ListParagraph"/>
+        <w:numPr>
+          <w:ilvl w:val="0"/>
+          <w:numId w:val="2"/>
+        </w:numPr>
+        <w:spacing w:after="120" w:before="0" w:line="256"/>
+      </w:pPr>
+      <w:r>
+        <w:rPr>
+          <w:rFonts w:ascii="Arial" w:cs="Arial" w:eastAsia="Arial" w:hAnsi="Arial"/>
+          <w:b/>
+          <w:bCs/>
+          <w:i w:val="false"/>
+          <w:iCs w:val="false"/>
+          <w:color w:val="17201C"/>
+          <w:sz w:val="19"/>
+          <w:szCs w:val="19"/>
+        </w:rPr>
+        <w:t xml:space="preserve">AllYourMonies </w:t>
+      </w:r>
+      <w:r>
+        <w:rPr>
+          <w:rFonts w:ascii="Arial" w:cs="Arial" w:eastAsia="Arial" w:hAnsi="Arial"/>
+          <w:b w:val="false"/>
+          <w:bCs w:val="false"/>
+          <w:i w:val="false"/>
+          <w:iCs w:val="false"/>
+          <w:color w:val="17201C"/>
+          <w:sz w:val="19"/>
+          <w:szCs w:val="19"/>
+        </w:rPr>
+        <w:t xml:space="preserve">staked $5.7k on BTS first-week sales landing under 3 million, about 116 times its own median trade. It does not bet that sales look soft; it names a number. A hard threshold called weeks early reads like someone who saw a real sales figure, the kind an insider might know ahead of public announcements.</w:t>
+      </w:r>
+    </w:p>
+    <w:p>
+      <w:pPr>
+        <w:pStyle w:val="ListParagraph"/>
+        <w:numPr>
+          <w:ilvl w:val="0"/>
+          <w:numId w:val="2"/>
+        </w:numPr>
+        <w:spacing w:after="120" w:before="0" w:line="256"/>
+      </w:pPr>
+      <w:r>
+        <w:rPr>
+          <w:rFonts w:ascii="Arial" w:cs="Arial" w:eastAsia="Arial" w:hAnsi="Arial"/>
+          <w:b/>
+          <w:bCs/>
+          <w:i w:val="false"/>
+          <w:iCs w:val="false"/>
+          <w:color w:val="17201C"/>
+          <w:sz w:val="19"/>
+          <w:szCs w:val="19"/>
+        </w:rPr>
+        <w:t xml:space="preserve">ScottyNooo </w:t>
+      </w:r>
+      <w:r>
+        <w:rPr>
+          <w:rFonts w:ascii="Arial" w:cs="Arial" w:eastAsia="Arial" w:hAnsi="Arial"/>
+          <w:b w:val="false"/>
+          <w:bCs w:val="false"/>
+          <w:i w:val="false"/>
+          <w:iCs w:val="false"/>
+          <w:color w:val="17201C"/>
+          <w:sz w:val="19"/>
+          <w:szCs w:val="19"/>
+        </w:rPr>
+        <w:t xml:space="preserve">bet $9.2k that Lady Gaga would not win three Grammys, at 43c, four days before the night resolved exactly that way. Awards markets leak through the people who decide them, voters, academy staff, publicists. Betting against a specific count, not just a win, is a finer read than the public had, and the contract swung down to 12c before settling NO.</w:t>
+      </w:r>
+    </w:p>
+    <w:p>
+      <w:pPr>
+        <w:spacing w:after="90" w:before="40" w:line="252"/>
+      </w:pPr>
+      <w:r>
+        <w:rPr>
+          <w:rFonts w:ascii="Arial" w:cs="Arial" w:eastAsia="Arial" w:hAnsi="Arial"/>
+          <w:b w:val="false"/>
+          <w:bCs w:val="false"/>
+          <w:i w:val="false"/>
+          <w:iCs w:val="false"/>
+          <w:color w:val="17201C"/>
+          <w:sz w:val="19"/>
+          <w:szCs w:val="19"/>
+        </w:rPr>
+        <w:t xml:space="preserve">All three paid up into resolution and broke entries into many small fills. That is what you do when you think the answer is fixed and you want size without moving the tape. Paying 90c for a contract you expect to settle at 100c is not careless; it is collecting a near-riskless spread.</w:t>
+      </w:r>
+    </w:p>
+    <w:tbl>
+      <w:tblPr>
+        <w:tblW w:type="dxa" w:w="10720"/>
+        <w:tblBorders>
+          <w:top w:val="single" w:color="auto" w:sz="4"/>
+          <w:left w:val="single" w:color="auto" w:sz="4"/>
+          <w:bottom w:val="single" w:color="auto" w:sz="4"/>
+          <w:right w:val="single" w:color="auto" w:sz="4"/>
+          <w:insideH w:val="single" w:color="auto" w:sz="4"/>
+          <w:insideV w:val="single" w:color="auto" w:sz="4"/>
+        </w:tblBorders>
+      </w:tblPr>
+      <w:tblGrid>
+        <w:gridCol w:w="10720"/>
+      </w:tblGrid>
+      <w:tr>
+        <w:tc>
+          <w:tcPr>
+            <w:tcW w:type="dxa" w:w="10720"/>
+            <w:tcBorders>
+              <w:top w:val="none"/>
+              <w:left w:val="single" w:color="D28B45" w:sz="16"/>
+              <w:bottom w:val="none"/>
+              <w:right w:val="none"/>
+            </w:tcBorders>
+            <w:shd w:fill="FFF3E3" w:val="clear"/>
+            <w:tcMar>
+              <w:top w:type="dxa" w:w="95"/>
+              <w:left w:type="dxa" w:w="140"/>
+              <w:bottom w:type="dxa" w:w="95"/>
+              <w:right w:type="dxa" w:w="110"/>
+            </w:tcMar>
+          </w:tcPr>
+          <w:p>
+            <w:pPr>
+              <w:spacing w:after="0" w:before="0" w:line="252"/>
+            </w:pPr>
+            <w:r>
+              <w:rPr>
+                <w:rFonts w:ascii="Arial" w:cs="Arial" w:eastAsia="Arial" w:hAnsi="Arial"/>
+                <w:b w:val="false"/>
+                <w:bCs w:val="false"/>
+                <w:i w:val="false"/>
+                <w:iCs w:val="false"/>
+                <w:color w:val="17201C"/>
+                <w:sz w:val="19"/>
+                <w:szCs w:val="19"/>
+              </w:rPr>
+              <w:t xml:space="preserve">For an investigations team, the names matter less than the signature they share: small in dollars, large for the wallet, early, priced well below certainty, in a market with a nameable information owner. That is a rule you can run continuously, and every hit is a starting point for attribution, from funding-source clustering to timing the position against when the private number actually existed.</w:t>
+            </w:r>
+          </w:p>
+        </w:tc>
+      </w:tr>
+    </w:tbl>
     <w:p>
       <w:pPr>
         <w:spacing w:after="90" w:before="0" w:line="252"/>
@@ -2594,7 +2678,7 @@
           <w:sz w:val="19"/>
           <w:szCs w:val="19"/>
         </w:rPr>
-        <w:t xml:space="preserve">Timing depends on the market. A production-result trade can be suspicious weeks before resolution. A streaming-rank trade can cluster closer to resolution if the edge comes from late platform or label data.</w:t>
+        <w:t xml:space="preserve">The caveat I would not bury: public data cannot prove intent. A sharp trader reads public signals well, and Kevindoto is a high-volume, profitable wallet that may simply be a good trader.</w:t>
       </w:r>
     </w:p>
     <w:p>
@@ -2616,7 +2700,7 @@
           <w:sz w:val="23"/>
           <w:szCs w:val="23"/>
         </w:rPr>
-        <w:t xml:space="preserve">Submission Methodology Appendix</w:t>
+        <w:t xml:space="preserve">Task 4 · Ranking and Methodology</w:t>
       </w:r>
     </w:p>
     <w:p>
@@ -2634,7 +2718,241 @@
           <w:sz w:val="19"/>
           <w:szCs w:val="19"/>
         </w:rPr>
-        <w:t xml:space="preserve">This appendix maps the memo to the four requested tasks so the document can stand on its own without sharing the full GitHub repository.</w:t>
+        <w:t xml:space="preserve">The ranking is a transparent point score, not a black box, applied to every qualifying wallet-market position and built from the same heuristics.</w:t>
+      </w:r>
+    </w:p>
+    <w:p>
+      <w:pPr>
+        <w:pStyle w:val="ListParagraph"/>
+        <w:numPr>
+          <w:ilvl w:val="0"/>
+          <w:numId w:val="2"/>
+        </w:numPr>
+        <w:spacing w:after="120" w:before="0" w:line="256"/>
+      </w:pPr>
+      <w:r>
+        <w:rPr>
+          <w:rFonts w:ascii="Arial" w:cs="Arial" w:eastAsia="Arial" w:hAnsi="Arial"/>
+          <w:b/>
+          <w:bCs/>
+          <w:i w:val="false"/>
+          <w:iCs w:val="false"/>
+          <w:color w:val="17201C"/>
+          <w:sz w:val="19"/>
+          <w:szCs w:val="19"/>
+        </w:rPr>
+        <w:t xml:space="preserve">Conviction </w:t>
+      </w:r>
+      <w:r>
+        <w:rPr>
+          <w:rFonts w:ascii="Arial" w:cs="Arial" w:eastAsia="Arial" w:hAnsi="Arial"/>
+          <w:b w:val="false"/>
+          <w:bCs w:val="false"/>
+          <w:i w:val="false"/>
+          <w:iCs w:val="false"/>
+          <w:color w:val="17201C"/>
+          <w:sz w:val="19"/>
+          <w:szCs w:val="19"/>
+        </w:rPr>
+        <w:t xml:space="preserve">— correct-side notional plus the payoff at stake. This is the bulk of the score.</w:t>
+      </w:r>
+    </w:p>
+    <w:p>
+      <w:pPr>
+        <w:pStyle w:val="ListParagraph"/>
+        <w:numPr>
+          <w:ilvl w:val="0"/>
+          <w:numId w:val="2"/>
+        </w:numPr>
+        <w:spacing w:after="120" w:before="0" w:line="256"/>
+      </w:pPr>
+      <w:r>
+        <w:rPr>
+          <w:rFonts w:ascii="Arial" w:cs="Arial" w:eastAsia="Arial" w:hAnsi="Arial"/>
+          <w:b/>
+          <w:bCs/>
+          <w:i w:val="false"/>
+          <w:iCs w:val="false"/>
+          <w:color w:val="17201C"/>
+          <w:sz w:val="19"/>
+          <w:szCs w:val="19"/>
+        </w:rPr>
+        <w:t xml:space="preserve">Non-obvious entry price </w:t>
+      </w:r>
+      <w:r>
+        <w:rPr>
+          <w:rFonts w:ascii="Arial" w:cs="Arial" w:eastAsia="Arial" w:hAnsi="Arial"/>
+          <w:b w:val="false"/>
+          <w:bCs w:val="false"/>
+          <w:i w:val="false"/>
+          <w:iCs w:val="false"/>
+          <w:color w:val="17201C"/>
+          <w:sz w:val="19"/>
+          <w:szCs w:val="19"/>
+        </w:rPr>
+        <w:t xml:space="preserve">— full credit below 60c, partial to 75c, nothing for near-certain buys.</w:t>
+      </w:r>
+    </w:p>
+    <w:p>
+      <w:pPr>
+        <w:pStyle w:val="ListParagraph"/>
+        <w:numPr>
+          <w:ilvl w:val="0"/>
+          <w:numId w:val="2"/>
+        </w:numPr>
+        <w:spacing w:after="120" w:before="0" w:line="256"/>
+      </w:pPr>
+      <w:r>
+        <w:rPr>
+          <w:rFonts w:ascii="Arial" w:cs="Arial" w:eastAsia="Arial" w:hAnsi="Arial"/>
+          <w:b/>
+          <w:bCs/>
+          <w:i w:val="false"/>
+          <w:iCs w:val="false"/>
+          <w:color w:val="17201C"/>
+          <w:sz w:val="19"/>
+          <w:szCs w:val="19"/>
+        </w:rPr>
+        <w:t xml:space="preserve">Lead time </w:t>
+      </w:r>
+      <w:r>
+        <w:rPr>
+          <w:rFonts w:ascii="Arial" w:cs="Arial" w:eastAsia="Arial" w:hAnsi="Arial"/>
+          <w:b w:val="false"/>
+          <w:bCs w:val="false"/>
+          <w:i w:val="false"/>
+          <w:iCs w:val="false"/>
+          <w:color w:val="17201C"/>
+          <w:sz w:val="19"/>
+          <w:szCs w:val="19"/>
+        </w:rPr>
+        <w:t xml:space="preserve">— more weight for entries a week or more before resolution.</w:t>
+      </w:r>
+    </w:p>
+    <w:p>
+      <w:pPr>
+        <w:pStyle w:val="ListParagraph"/>
+        <w:numPr>
+          <w:ilvl w:val="0"/>
+          <w:numId w:val="2"/>
+        </w:numPr>
+        <w:spacing w:after="120" w:before="0" w:line="256"/>
+      </w:pPr>
+      <w:r>
+        <w:rPr>
+          <w:rFonts w:ascii="Arial" w:cs="Arial" w:eastAsia="Arial" w:hAnsi="Arial"/>
+          <w:b/>
+          <w:bCs/>
+          <w:i w:val="false"/>
+          <w:iCs w:val="false"/>
+          <w:color w:val="17201C"/>
+          <w:sz w:val="19"/>
+          <w:szCs w:val="19"/>
+        </w:rPr>
+        <w:t xml:space="preserve">Clean history </w:t>
+      </w:r>
+      <w:r>
+        <w:rPr>
+          <w:rFonts w:ascii="Arial" w:cs="Arial" w:eastAsia="Arial" w:hAnsi="Arial"/>
+          <w:b w:val="false"/>
+          <w:bCs w:val="false"/>
+          <w:i w:val="false"/>
+          <w:iCs w:val="false"/>
+          <w:color w:val="17201C"/>
+          <w:sz w:val="19"/>
+          <w:szCs w:val="19"/>
+        </w:rPr>
+        <w:t xml:space="preserve">— a bonus when the wallet's wash-trade share is low.</w:t>
+      </w:r>
+    </w:p>
+    <w:p>
+      <w:pPr>
+        <w:pStyle w:val="ListParagraph"/>
+        <w:numPr>
+          <w:ilvl w:val="0"/>
+          <w:numId w:val="2"/>
+        </w:numPr>
+        <w:spacing w:after="120" w:before="0" w:line="256"/>
+      </w:pPr>
+      <w:r>
+        <w:rPr>
+          <w:rFonts w:ascii="Arial" w:cs="Arial" w:eastAsia="Arial" w:hAnsi="Arial"/>
+          <w:b/>
+          <w:bCs/>
+          <w:i w:val="false"/>
+          <w:iCs w:val="false"/>
+          <w:color w:val="17201C"/>
+          <w:sz w:val="19"/>
+          <w:szCs w:val="19"/>
+        </w:rPr>
+        <w:t xml:space="preserve">Wallet-relative size </w:t>
+      </w:r>
+      <w:r>
+        <w:rPr>
+          <w:rFonts w:ascii="Arial" w:cs="Arial" w:eastAsia="Arial" w:hAnsi="Arial"/>
+          <w:b w:val="false"/>
+          <w:bCs w:val="false"/>
+          <w:i w:val="false"/>
+          <w:iCs w:val="false"/>
+          <w:color w:val="17201C"/>
+          <w:sz w:val="19"/>
+          <w:szCs w:val="19"/>
+        </w:rPr>
+        <w:t xml:space="preserve">— a jump of 50x or more over the wallet's own median trade.</w:t>
+      </w:r>
+    </w:p>
+    <w:p>
+      <w:pPr>
+        <w:pStyle w:val="ListParagraph"/>
+        <w:numPr>
+          <w:ilvl w:val="0"/>
+          <w:numId w:val="2"/>
+        </w:numPr>
+        <w:spacing w:after="120" w:before="0" w:line="256"/>
+      </w:pPr>
+      <w:r>
+        <w:rPr>
+          <w:rFonts w:ascii="Arial" w:cs="Arial" w:eastAsia="Arial" w:hAnsi="Arial"/>
+          <w:b/>
+          <w:bCs/>
+          <w:i w:val="false"/>
+          <w:iCs w:val="false"/>
+          <w:color w:val="17201C"/>
+          <w:sz w:val="19"/>
+          <w:szCs w:val="19"/>
+        </w:rPr>
+        <w:t xml:space="preserve">Public-data control penalty </w:t>
+      </w:r>
+      <w:r>
+        <w:rPr>
+          <w:rFonts w:ascii="Arial" w:cs="Arial" w:eastAsia="Arial" w:hAnsi="Arial"/>
+          <w:b w:val="false"/>
+          <w:bCs w:val="false"/>
+          <w:i w:val="false"/>
+          <w:iCs w:val="false"/>
+          <w:color w:val="17201C"/>
+          <w:sz w:val="19"/>
+          <w:szCs w:val="19"/>
+        </w:rPr>
+        <w:t xml:space="preserve">— Google-trend markets are demoted and pulled out of the insider queue, since public search data explains the edge.</w:t>
+      </w:r>
+    </w:p>
+    <w:p>
+      <w:pPr>
+        <w:spacing w:after="90" w:before="40" w:line="252"/>
+      </w:pPr>
+      <w:r>
+        <w:rPr>
+          <w:rFonts w:ascii="Arial" w:cs="Arial" w:eastAsia="Arial" w:hAnsi="Arial"/>
+          <w:b w:val="false"/>
+          <w:bCs w:val="false"/>
+          <w:i w:val="false"/>
+          <w:iCs w:val="false"/>
+          <w:color w:val="17201C"/>
+          <w:sz w:val="19"/>
+          <w:szCs w:val="19"/>
+        </w:rPr>
+        <w:t xml:space="preserve">Ranked on merit with controls removed, the top of the queue is:</w:t>
       </w:r>
     </w:p>
     <w:tbl>
@@ -2650,9 +2968,11 @@
         </w:tblBorders>
       </w:tblPr>
       <w:tblGrid>
-        <w:gridCol w:w="2200"/>
-        <w:gridCol w:w="5700"/>
-        <w:gridCol w:w="2820"/>
+        <w:gridCol w:w="650"/>
+        <w:gridCol w:w="3300"/>
+        <w:gridCol w:w="3100"/>
+        <w:gridCol w:w="1000"/>
+        <w:gridCol w:w="2670"/>
       </w:tblGrid>
       <w:tr>
         <w:trPr>
@@ -2660,7 +2980,7 @@
         </w:trPr>
         <w:tc>
           <w:tcPr>
-            <w:tcW w:type="dxa" w:w="2200"/>
+            <w:tcW w:type="dxa" w:w="650"/>
             <w:tcBorders>
               <w:top w:val="single" w:color="CBD8D2" w:sz="1"/>
               <w:left w:val="single" w:color="CBD8D2" w:sz="1"/>
@@ -2692,13 +3012,13 @@
                 <w:sz w:val="16"/>
                 <w:szCs w:val="16"/>
               </w:rPr>
-              <w:t xml:space="preserve">Assignment task</w:t>
-            </w:r>
-          </w:p>
-        </w:tc>
-        <w:tc>
-          <w:tcPr>
-            <w:tcW w:type="dxa" w:w="5700"/>
+              <w:t xml:space="preserve">#</w:t>
+            </w:r>
+          </w:p>
+        </w:tc>
+        <w:tc>
+          <w:tcPr>
+            <w:tcW w:type="dxa" w:w="3300"/>
             <w:tcBorders>
               <w:top w:val="single" w:color="CBD8D2" w:sz="1"/>
               <w:left w:val="single" w:color="CBD8D2" w:sz="1"/>
@@ -2730,13 +3050,13 @@
                 <w:sz w:val="16"/>
                 <w:szCs w:val="16"/>
               </w:rPr>
-              <w:t xml:space="preserve">What I did</w:t>
-            </w:r>
-          </w:p>
-        </w:tc>
-        <w:tc>
-          <w:tcPr>
-            <w:tcW w:type="dxa" w:w="2820"/>
+              <w:t xml:space="preserve">Wallet</w:t>
+            </w:r>
+          </w:p>
+        </w:tc>
+        <w:tc>
+          <w:tcPr>
+            <w:tcW w:type="dxa" w:w="3100"/>
             <w:tcBorders>
               <w:top w:val="single" w:color="CBD8D2" w:sz="1"/>
               <w:left w:val="single" w:color="CBD8D2" w:sz="1"/>
@@ -2768,7 +3088,83 @@
                 <w:sz w:val="16"/>
                 <w:szCs w:val="16"/>
               </w:rPr>
-              <w:t xml:space="preserve">Result</w:t>
+              <w:t xml:space="preserve">Market type</w:t>
+            </w:r>
+          </w:p>
+        </w:tc>
+        <w:tc>
+          <w:tcPr>
+            <w:tcW w:type="dxa" w:w="1000"/>
+            <w:tcBorders>
+              <w:top w:val="single" w:color="CBD8D2" w:sz="1"/>
+              <w:left w:val="single" w:color="CBD8D2" w:sz="1"/>
+              <w:bottom w:val="single" w:color="CBD8D2" w:sz="1"/>
+              <w:right w:val="single" w:color="CBD8D2" w:sz="1"/>
+            </w:tcBorders>
+            <w:shd w:fill="DCEBE5" w:val="clear"/>
+            <w:tcMar>
+              <w:top w:type="dxa" w:w="70"/>
+              <w:left w:type="dxa" w:w="95"/>
+              <w:bottom w:type="dxa" w:w="70"/>
+              <w:right w:type="dxa" w:w="95"/>
+            </w:tcMar>
+            <w:vAlign w:val="top"/>
+          </w:tcPr>
+          <w:p>
+            <w:pPr>
+              <w:spacing w:after="0" w:before="0" w:line="252"/>
+              <w:jc w:val="center"/>
+            </w:pPr>
+            <w:r>
+              <w:rPr>
+                <w:rFonts w:ascii="Arial" w:cs="Arial" w:eastAsia="Arial" w:hAnsi="Arial"/>
+                <w:b/>
+                <w:bCs/>
+                <w:i w:val="false"/>
+                <w:iCs w:val="false"/>
+                <w:color w:val="102B24"/>
+                <w:sz w:val="16"/>
+                <w:szCs w:val="16"/>
+              </w:rPr>
+              <w:t xml:space="preserve">Score</w:t>
+            </w:r>
+          </w:p>
+        </w:tc>
+        <w:tc>
+          <w:tcPr>
+            <w:tcW w:type="dxa" w:w="2670"/>
+            <w:tcBorders>
+              <w:top w:val="single" w:color="CBD8D2" w:sz="1"/>
+              <w:left w:val="single" w:color="CBD8D2" w:sz="1"/>
+              <w:bottom w:val="single" w:color="CBD8D2" w:sz="1"/>
+              <w:right w:val="single" w:color="CBD8D2" w:sz="1"/>
+            </w:tcBorders>
+            <w:shd w:fill="DCEBE5" w:val="clear"/>
+            <w:tcMar>
+              <w:top w:type="dxa" w:w="70"/>
+              <w:left w:type="dxa" w:w="95"/>
+              <w:bottom w:type="dxa" w:w="70"/>
+              <w:right w:type="dxa" w:w="95"/>
+            </w:tcMar>
+            <w:vAlign w:val="top"/>
+          </w:tcPr>
+          <w:p>
+            <w:pPr>
+              <w:spacing w:after="0" w:before="0" w:line="252"/>
+              <w:jc w:val="center"/>
+            </w:pPr>
+            <w:r>
+              <w:rPr>
+                <w:rFonts w:ascii="Arial" w:cs="Arial" w:eastAsia="Arial" w:hAnsi="Arial"/>
+                <w:b/>
+                <w:bCs/>
+                <w:i w:val="false"/>
+                <w:iCs w:val="false"/>
+                <w:color w:val="102B24"/>
+                <w:sz w:val="16"/>
+                <w:szCs w:val="16"/>
+              </w:rPr>
+              <w:t xml:space="preserve">In report</w:t>
             </w:r>
           </w:p>
         </w:tc>
@@ -2776,109 +3172,181 @@
       <w:tr>
         <w:tc>
           <w:tcPr>
-            <w:tcW w:type="dxa" w:w="2200"/>
-            <w:tcBorders>
-              <w:top w:val="single" w:color="CBD8D2" w:sz="1"/>
-              <w:left w:val="single" w:color="CBD8D2" w:sz="1"/>
-              <w:bottom w:val="single" w:color="CBD8D2" w:sz="1"/>
-              <w:right w:val="single" w:color="CBD8D2" w:sz="1"/>
-            </w:tcBorders>
-            <w:tcMar>
-              <w:top w:type="dxa" w:w="70"/>
-              <w:left w:type="dxa" w:w="95"/>
-              <w:bottom w:type="dxa" w:w="70"/>
-              <w:right w:type="dxa" w:w="95"/>
-            </w:tcMar>
-            <w:vAlign w:val="top"/>
-          </w:tcPr>
-          <w:p>
-            <w:pPr>
-              <w:spacing w:after="0" w:before="0" w:line="252"/>
-            </w:pPr>
-            <w:r>
-              <w:rPr>
-                <w:rFonts w:ascii="Arial" w:cs="Arial" w:eastAsia="Arial" w:hAnsi="Arial"/>
-                <w:b w:val="false"/>
-                <w:bCs w:val="false"/>
-                <w:i w:val="false"/>
-                <w:iCs w:val="false"/>
-                <w:color w:val="17201C"/>
-                <w:sz w:val="19"/>
-                <w:szCs w:val="19"/>
-              </w:rPr>
-              <w:t xml:space="preserve">1. Data collection</w:t>
-            </w:r>
-          </w:p>
-        </w:tc>
-        <w:tc>
-          <w:tcPr>
-            <w:tcW w:type="dxa" w:w="5700"/>
-            <w:tcBorders>
-              <w:top w:val="single" w:color="CBD8D2" w:sz="1"/>
-              <w:left w:val="single" w:color="CBD8D2" w:sz="1"/>
-              <w:bottom w:val="single" w:color="CBD8D2" w:sz="1"/>
-              <w:right w:val="single" w:color="CBD8D2" w:sz="1"/>
-            </w:tcBorders>
-            <w:tcMar>
-              <w:top w:type="dxa" w:w="70"/>
-              <w:left w:type="dxa" w:w="95"/>
-              <w:bottom w:type="dxa" w:w="70"/>
-              <w:right w:type="dxa" w:w="95"/>
-            </w:tcMar>
-            <w:vAlign w:val="top"/>
-          </w:tcPr>
-          <w:p>
-            <w:pPr>
-              <w:spacing w:after="0" w:before="0" w:line="252"/>
-            </w:pPr>
-            <w:r>
-              <w:rPr>
-                <w:rFonts w:ascii="Arial" w:cs="Arial" w:eastAsia="Arial" w:hAnsi="Arial"/>
-                <w:b w:val="false"/>
-                <w:bCs w:val="false"/>
-                <w:i w:val="false"/>
-                <w:iCs w:val="false"/>
-                <w:color w:val="17201C"/>
-                <w:sz w:val="19"/>
-                <w:szCs w:val="19"/>
-              </w:rPr>
-              <w:t xml:space="preserve">Public Polymarket markets, trades, wallet stats, and refreshed trade API data for selected contracts.</w:t>
-            </w:r>
-          </w:p>
-        </w:tc>
-        <w:tc>
-          <w:tcPr>
-            <w:tcW w:type="dxa" w:w="2820"/>
-            <w:tcBorders>
-              <w:top w:val="single" w:color="CBD8D2" w:sz="1"/>
-              <w:left w:val="single" w:color="CBD8D2" w:sz="1"/>
-              <w:bottom w:val="single" w:color="CBD8D2" w:sz="1"/>
-              <w:right w:val="single" w:color="CBD8D2" w:sz="1"/>
-            </w:tcBorders>
-            <w:tcMar>
-              <w:top w:type="dxa" w:w="70"/>
-              <w:left w:type="dxa" w:w="95"/>
-              <w:bottom w:type="dxa" w:w="70"/>
-              <w:right w:type="dxa" w:w="95"/>
-            </w:tcMar>
-            <w:vAlign w:val="top"/>
-          </w:tcPr>
-          <w:p>
-            <w:pPr>
-              <w:spacing w:after="0" w:before="0" w:line="252"/>
-            </w:pPr>
-            <w:r>
-              <w:rPr>
-                <w:rFonts w:ascii="Arial" w:cs="Arial" w:eastAsia="Arial" w:hAnsi="Arial"/>
-                <w:b w:val="false"/>
-                <w:bCs w:val="false"/>
-                <w:i w:val="false"/>
-                <w:iCs w:val="false"/>
-                <w:color w:val="17201C"/>
-                <w:sz w:val="19"/>
-                <w:szCs w:val="19"/>
-              </w:rPr>
-              <w:t xml:space="preserve">154 markets, 205,362 trades, 44,607 wallets.</w:t>
+            <w:tcW w:type="dxa" w:w="650"/>
+            <w:tcBorders>
+              <w:top w:val="single" w:color="CBD8D2" w:sz="1"/>
+              <w:left w:val="single" w:color="CBD8D2" w:sz="1"/>
+              <w:bottom w:val="single" w:color="CBD8D2" w:sz="1"/>
+              <w:right w:val="single" w:color="CBD8D2" w:sz="1"/>
+            </w:tcBorders>
+            <w:tcMar>
+              <w:top w:type="dxa" w:w="70"/>
+              <w:left w:type="dxa" w:w="95"/>
+              <w:bottom w:type="dxa" w:w="70"/>
+              <w:right w:type="dxa" w:w="95"/>
+            </w:tcMar>
+            <w:vAlign w:val="top"/>
+          </w:tcPr>
+          <w:p>
+            <w:pPr>
+              <w:spacing w:after="0" w:before="0" w:line="252"/>
+            </w:pPr>
+            <w:r>
+              <w:rPr>
+                <w:rFonts w:ascii="Arial" w:cs="Arial" w:eastAsia="Arial" w:hAnsi="Arial"/>
+                <w:b w:val="false"/>
+                <w:bCs w:val="false"/>
+                <w:i w:val="false"/>
+                <w:iCs w:val="false"/>
+                <w:color w:val="17201C"/>
+                <w:sz w:val="19"/>
+                <w:szCs w:val="19"/>
+              </w:rPr>
+              <w:t xml:space="preserve">1</w:t>
+            </w:r>
+          </w:p>
+        </w:tc>
+        <w:tc>
+          <w:tcPr>
+            <w:tcW w:type="dxa" w:w="3300"/>
+            <w:tcBorders>
+              <w:top w:val="single" w:color="CBD8D2" w:sz="1"/>
+              <w:left w:val="single" w:color="CBD8D2" w:sz="1"/>
+              <w:bottom w:val="single" w:color="CBD8D2" w:sz="1"/>
+              <w:right w:val="single" w:color="CBD8D2" w:sz="1"/>
+            </w:tcBorders>
+            <w:tcMar>
+              <w:top w:type="dxa" w:w="70"/>
+              <w:left w:type="dxa" w:w="95"/>
+              <w:bottom w:type="dxa" w:w="70"/>
+              <w:right w:type="dxa" w:w="95"/>
+            </w:tcMar>
+            <w:vAlign w:val="top"/>
+          </w:tcPr>
+          <w:p>
+            <w:pPr>
+              <w:spacing w:after="0" w:before="0" w:line="252"/>
+            </w:pPr>
+            <w:r>
+              <w:rPr>
+                <w:rFonts w:ascii="Arial" w:cs="Arial" w:eastAsia="Arial" w:hAnsi="Arial"/>
+                <w:b w:val="false"/>
+                <w:bCs w:val="false"/>
+                <w:i w:val="false"/>
+                <w:iCs w:val="false"/>
+                <w:color w:val="17201C"/>
+                <w:sz w:val="19"/>
+                <w:szCs w:val="19"/>
+              </w:rPr>
+              <w:t xml:space="preserve">Kevindoto</w:t>
+            </w:r>
+          </w:p>
+        </w:tc>
+        <w:tc>
+          <w:tcPr>
+            <w:tcW w:type="dxa" w:w="3100"/>
+            <w:tcBorders>
+              <w:top w:val="single" w:color="CBD8D2" w:sz="1"/>
+              <w:left w:val="single" w:color="CBD8D2" w:sz="1"/>
+              <w:bottom w:val="single" w:color="CBD8D2" w:sz="1"/>
+              <w:right w:val="single" w:color="CBD8D2" w:sz="1"/>
+            </w:tcBorders>
+            <w:tcMar>
+              <w:top w:type="dxa" w:w="70"/>
+              <w:left w:type="dxa" w:w="95"/>
+              <w:bottom w:type="dxa" w:w="70"/>
+              <w:right w:type="dxa" w:w="95"/>
+            </w:tcMar>
+            <w:vAlign w:val="top"/>
+          </w:tcPr>
+          <w:p>
+            <w:pPr>
+              <w:spacing w:after="0" w:before="0" w:line="252"/>
+            </w:pPr>
+            <w:r>
+              <w:rPr>
+                <w:rFonts w:ascii="Arial" w:cs="Arial" w:eastAsia="Arial" w:hAnsi="Arial"/>
+                <w:b w:val="false"/>
+                <w:bCs w:val="false"/>
+                <w:i w:val="false"/>
+                <w:iCs w:val="false"/>
+                <w:color w:val="17201C"/>
+                <w:sz w:val="19"/>
+                <w:szCs w:val="19"/>
+              </w:rPr>
+              <w:t xml:space="preserve">Music streaming rank</w:t>
+            </w:r>
+          </w:p>
+        </w:tc>
+        <w:tc>
+          <w:tcPr>
+            <w:tcW w:type="dxa" w:w="1000"/>
+            <w:tcBorders>
+              <w:top w:val="single" w:color="CBD8D2" w:sz="1"/>
+              <w:left w:val="single" w:color="CBD8D2" w:sz="1"/>
+              <w:bottom w:val="single" w:color="CBD8D2" w:sz="1"/>
+              <w:right w:val="single" w:color="CBD8D2" w:sz="1"/>
+            </w:tcBorders>
+            <w:tcMar>
+              <w:top w:type="dxa" w:w="70"/>
+              <w:left w:type="dxa" w:w="95"/>
+              <w:bottom w:type="dxa" w:w="70"/>
+              <w:right w:type="dxa" w:w="95"/>
+            </w:tcMar>
+            <w:vAlign w:val="top"/>
+          </w:tcPr>
+          <w:p>
+            <w:pPr>
+              <w:spacing w:after="0" w:before="0" w:line="252"/>
+            </w:pPr>
+            <w:r>
+              <w:rPr>
+                <w:rFonts w:ascii="Arial" w:cs="Arial" w:eastAsia="Arial" w:hAnsi="Arial"/>
+                <w:b w:val="false"/>
+                <w:bCs w:val="false"/>
+                <w:i w:val="false"/>
+                <w:iCs w:val="false"/>
+                <w:color w:val="17201C"/>
+                <w:sz w:val="19"/>
+                <w:szCs w:val="19"/>
+              </w:rPr>
+              <w:t xml:space="preserve">71</w:t>
+            </w:r>
+          </w:p>
+        </w:tc>
+        <w:tc>
+          <w:tcPr>
+            <w:tcW w:type="dxa" w:w="2670"/>
+            <w:tcBorders>
+              <w:top w:val="single" w:color="CBD8D2" w:sz="1"/>
+              <w:left w:val="single" w:color="CBD8D2" w:sz="1"/>
+              <w:bottom w:val="single" w:color="CBD8D2" w:sz="1"/>
+              <w:right w:val="single" w:color="CBD8D2" w:sz="1"/>
+            </w:tcBorders>
+            <w:tcMar>
+              <w:top w:type="dxa" w:w="70"/>
+              <w:left w:type="dxa" w:w="95"/>
+              <w:bottom w:type="dxa" w:w="70"/>
+              <w:right w:type="dxa" w:w="95"/>
+            </w:tcMar>
+            <w:vAlign w:val="top"/>
+          </w:tcPr>
+          <w:p>
+            <w:pPr>
+              <w:spacing w:after="0" w:before="0" w:line="252"/>
+            </w:pPr>
+            <w:r>
+              <w:rPr>
+                <w:rFonts w:ascii="Arial" w:cs="Arial" w:eastAsia="Arial" w:hAnsi="Arial"/>
+                <w:b w:val="false"/>
+                <w:bCs w:val="false"/>
+                <w:i w:val="false"/>
+                <w:iCs w:val="false"/>
+                <w:color w:val="17201C"/>
+                <w:sz w:val="19"/>
+                <w:szCs w:val="19"/>
+              </w:rPr>
+              <w:t xml:space="preserve">Yes</w:t>
             </w:r>
           </w:p>
         </w:tc>
@@ -2886,7 +3354,7 @@
       <w:tr>
         <w:tc>
           <w:tcPr>
-            <w:tcW w:type="dxa" w:w="2200"/>
+            <w:tcW w:type="dxa" w:w="650"/>
             <w:tcBorders>
               <w:top w:val="single" w:color="CBD8D2" w:sz="1"/>
               <w:left w:val="single" w:color="CBD8D2" w:sz="1"/>
@@ -2917,13 +3385,13 @@
                 <w:sz w:val="19"/>
                 <w:szCs w:val="19"/>
               </w:rPr>
-              <w:t xml:space="preserve">2. Heuristic design</w:t>
-            </w:r>
-          </w:p>
-        </w:tc>
-        <w:tc>
-          <w:tcPr>
-            <w:tcW w:type="dxa" w:w="5700"/>
+              <w:t xml:space="preserve">2</w:t>
+            </w:r>
+          </w:p>
+        </w:tc>
+        <w:tc>
+          <w:tcPr>
+            <w:tcW w:type="dxa" w:w="3300"/>
             <w:tcBorders>
               <w:top w:val="single" w:color="CBD8D2" w:sz="1"/>
               <w:left w:val="single" w:color="CBD8D2" w:sz="1"/>
@@ -2954,13 +3422,13 @@
                 <w:sz w:val="19"/>
                 <w:szCs w:val="19"/>
               </w:rPr>
-              <w:t xml:space="preserve">Explainable screen: access point, non-obvious price, wallet behavior, wash/noise filter, contract movement.</w:t>
-            </w:r>
-          </w:p>
-        </w:tc>
-        <w:tc>
-          <w:tcPr>
-            <w:tcW w:type="dxa" w:w="2820"/>
+              <w:t xml:space="preserve">ScottyNooo</w:t>
+            </w:r>
+          </w:p>
+        </w:tc>
+        <w:tc>
+          <w:tcPr>
+            <w:tcW w:type="dxa" w:w="3100"/>
             <w:tcBorders>
               <w:top w:val="single" w:color="CBD8D2" w:sz="1"/>
               <w:left w:val="single" w:color="CBD8D2" w:sz="1"/>
@@ -2991,7 +3459,81 @@
                 <w:sz w:val="19"/>
                 <w:szCs w:val="19"/>
               </w:rPr>
-              <w:t xml:space="preserve">No black-box score in the memo.</w:t>
+              <w:t xml:space="preserve">Awards</w:t>
+            </w:r>
+          </w:p>
+        </w:tc>
+        <w:tc>
+          <w:tcPr>
+            <w:tcW w:type="dxa" w:w="1000"/>
+            <w:tcBorders>
+              <w:top w:val="single" w:color="CBD8D2" w:sz="1"/>
+              <w:left w:val="single" w:color="CBD8D2" w:sz="1"/>
+              <w:bottom w:val="single" w:color="CBD8D2" w:sz="1"/>
+              <w:right w:val="single" w:color="CBD8D2" w:sz="1"/>
+            </w:tcBorders>
+            <w:shd w:fill="F4F7F2" w:val="clear"/>
+            <w:tcMar>
+              <w:top w:type="dxa" w:w="70"/>
+              <w:left w:type="dxa" w:w="95"/>
+              <w:bottom w:type="dxa" w:w="70"/>
+              <w:right w:type="dxa" w:w="95"/>
+            </w:tcMar>
+            <w:vAlign w:val="top"/>
+          </w:tcPr>
+          <w:p>
+            <w:pPr>
+              <w:spacing w:after="0" w:before="0" w:line="252"/>
+            </w:pPr>
+            <w:r>
+              <w:rPr>
+                <w:rFonts w:ascii="Arial" w:cs="Arial" w:eastAsia="Arial" w:hAnsi="Arial"/>
+                <w:b w:val="false"/>
+                <w:bCs w:val="false"/>
+                <w:i w:val="false"/>
+                <w:iCs w:val="false"/>
+                <w:color w:val="17201C"/>
+                <w:sz w:val="19"/>
+                <w:szCs w:val="19"/>
+              </w:rPr>
+              <w:t xml:space="preserve">69</w:t>
+            </w:r>
+          </w:p>
+        </w:tc>
+        <w:tc>
+          <w:tcPr>
+            <w:tcW w:type="dxa" w:w="2670"/>
+            <w:tcBorders>
+              <w:top w:val="single" w:color="CBD8D2" w:sz="1"/>
+              <w:left w:val="single" w:color="CBD8D2" w:sz="1"/>
+              <w:bottom w:val="single" w:color="CBD8D2" w:sz="1"/>
+              <w:right w:val="single" w:color="CBD8D2" w:sz="1"/>
+            </w:tcBorders>
+            <w:shd w:fill="F4F7F2" w:val="clear"/>
+            <w:tcMar>
+              <w:top w:type="dxa" w:w="70"/>
+              <w:left w:type="dxa" w:w="95"/>
+              <w:bottom w:type="dxa" w:w="70"/>
+              <w:right w:type="dxa" w:w="95"/>
+            </w:tcMar>
+            <w:vAlign w:val="top"/>
+          </w:tcPr>
+          <w:p>
+            <w:pPr>
+              <w:spacing w:after="0" w:before="0" w:line="252"/>
+            </w:pPr>
+            <w:r>
+              <w:rPr>
+                <w:rFonts w:ascii="Arial" w:cs="Arial" w:eastAsia="Arial" w:hAnsi="Arial"/>
+                <w:b w:val="false"/>
+                <w:bCs w:val="false"/>
+                <w:i w:val="false"/>
+                <w:iCs w:val="false"/>
+                <w:color w:val="17201C"/>
+                <w:sz w:val="19"/>
+                <w:szCs w:val="19"/>
+              </w:rPr>
+              <w:t xml:space="preserve">Yes</w:t>
             </w:r>
           </w:p>
         </w:tc>
@@ -2999,109 +3541,181 @@
       <w:tr>
         <w:tc>
           <w:tcPr>
-            <w:tcW w:type="dxa" w:w="2200"/>
-            <w:tcBorders>
-              <w:top w:val="single" w:color="CBD8D2" w:sz="1"/>
-              <w:left w:val="single" w:color="CBD8D2" w:sz="1"/>
-              <w:bottom w:val="single" w:color="CBD8D2" w:sz="1"/>
-              <w:right w:val="single" w:color="CBD8D2" w:sz="1"/>
-            </w:tcBorders>
-            <w:tcMar>
-              <w:top w:type="dxa" w:w="70"/>
-              <w:left w:type="dxa" w:w="95"/>
-              <w:bottom w:type="dxa" w:w="70"/>
-              <w:right w:type="dxa" w:w="95"/>
-            </w:tcMar>
-            <w:vAlign w:val="top"/>
-          </w:tcPr>
-          <w:p>
-            <w:pPr>
-              <w:spacing w:after="0" w:before="0" w:line="252"/>
-            </w:pPr>
-            <w:r>
-              <w:rPr>
-                <w:rFonts w:ascii="Arial" w:cs="Arial" w:eastAsia="Arial" w:hAnsi="Arial"/>
-                <w:b w:val="false"/>
-                <w:bCs w:val="false"/>
-                <w:i w:val="false"/>
-                <w:iCs w:val="false"/>
-                <w:color w:val="17201C"/>
-                <w:sz w:val="19"/>
-                <w:szCs w:val="19"/>
-              </w:rPr>
-              <w:t xml:space="preserve">3. Application to traders</w:t>
-            </w:r>
-          </w:p>
-        </w:tc>
-        <w:tc>
-          <w:tcPr>
-            <w:tcW w:type="dxa" w:w="5700"/>
-            <w:tcBorders>
-              <w:top w:val="single" w:color="CBD8D2" w:sz="1"/>
-              <w:left w:val="single" w:color="CBD8D2" w:sz="1"/>
-              <w:bottom w:val="single" w:color="CBD8D2" w:sz="1"/>
-              <w:right w:val="single" w:color="CBD8D2" w:sz="1"/>
-            </w:tcBorders>
-            <w:tcMar>
-              <w:top w:type="dxa" w:w="70"/>
-              <w:left w:type="dxa" w:w="95"/>
-              <w:bottom w:type="dxa" w:w="70"/>
-              <w:right w:type="dxa" w:w="95"/>
-            </w:tcMar>
-            <w:vAlign w:val="top"/>
-          </w:tcPr>
-          <w:p>
-            <w:pPr>
-              <w:spacing w:after="0" w:before="0" w:line="252"/>
-            </w:pPr>
-            <w:r>
-              <w:rPr>
-                <w:rFonts w:ascii="Arial" w:cs="Arial" w:eastAsia="Arial" w:hAnsi="Arial"/>
-                <w:b w:val="false"/>
-                <w:bCs w:val="false"/>
-                <w:i w:val="false"/>
-                <w:iCs w:val="false"/>
-                <w:color w:val="17201C"/>
-                <w:sz w:val="19"/>
-                <w:szCs w:val="19"/>
-              </w:rPr>
-              <w:t xml:space="preserve">Screened wallet-market clusters, then manually reviewed the strongest rows.</w:t>
-            </w:r>
-          </w:p>
-        </w:tc>
-        <w:tc>
-          <w:tcPr>
-            <w:tcW w:type="dxa" w:w="2820"/>
-            <w:tcBorders>
-              <w:top w:val="single" w:color="CBD8D2" w:sz="1"/>
-              <w:left w:val="single" w:color="CBD8D2" w:sz="1"/>
-              <w:bottom w:val="single" w:color="CBD8D2" w:sz="1"/>
-              <w:right w:val="single" w:color="CBD8D2" w:sz="1"/>
-            </w:tcBorders>
-            <w:tcMar>
-              <w:top w:type="dxa" w:w="70"/>
-              <w:left w:type="dxa" w:w="95"/>
-              <w:bottom w:type="dxa" w:w="70"/>
-              <w:right w:type="dxa" w:w="95"/>
-            </w:tcMar>
-            <w:vAlign w:val="top"/>
-          </w:tcPr>
-          <w:p>
-            <w:pPr>
-              <w:spacing w:after="0" w:before="0" w:line="252"/>
-            </w:pPr>
-            <w:r>
-              <w:rPr>
-                <w:rFonts w:ascii="Arial" w:cs="Arial" w:eastAsia="Arial" w:hAnsi="Arial"/>
-                <w:b w:val="false"/>
-                <w:bCs w:val="false"/>
-                <w:i w:val="false"/>
-                <w:iCs w:val="false"/>
-                <w:color w:val="17201C"/>
-                <w:sz w:val="19"/>
-                <w:szCs w:val="19"/>
-              </w:rPr>
-              <w:t xml:space="preserve">Three wallets, four positions.</w:t>
+            <w:tcW w:type="dxa" w:w="650"/>
+            <w:tcBorders>
+              <w:top w:val="single" w:color="CBD8D2" w:sz="1"/>
+              <w:left w:val="single" w:color="CBD8D2" w:sz="1"/>
+              <w:bottom w:val="single" w:color="CBD8D2" w:sz="1"/>
+              <w:right w:val="single" w:color="CBD8D2" w:sz="1"/>
+            </w:tcBorders>
+            <w:tcMar>
+              <w:top w:type="dxa" w:w="70"/>
+              <w:left w:type="dxa" w:w="95"/>
+              <w:bottom w:type="dxa" w:w="70"/>
+              <w:right w:type="dxa" w:w="95"/>
+            </w:tcMar>
+            <w:vAlign w:val="top"/>
+          </w:tcPr>
+          <w:p>
+            <w:pPr>
+              <w:spacing w:after="0" w:before="0" w:line="252"/>
+            </w:pPr>
+            <w:r>
+              <w:rPr>
+                <w:rFonts w:ascii="Arial" w:cs="Arial" w:eastAsia="Arial" w:hAnsi="Arial"/>
+                <w:b w:val="false"/>
+                <w:bCs w:val="false"/>
+                <w:i w:val="false"/>
+                <w:iCs w:val="false"/>
+                <w:color w:val="17201C"/>
+                <w:sz w:val="19"/>
+                <w:szCs w:val="19"/>
+              </w:rPr>
+              <w:t xml:space="preserve">3</w:t>
+            </w:r>
+          </w:p>
+        </w:tc>
+        <w:tc>
+          <w:tcPr>
+            <w:tcW w:type="dxa" w:w="3300"/>
+            <w:tcBorders>
+              <w:top w:val="single" w:color="CBD8D2" w:sz="1"/>
+              <w:left w:val="single" w:color="CBD8D2" w:sz="1"/>
+              <w:bottom w:val="single" w:color="CBD8D2" w:sz="1"/>
+              <w:right w:val="single" w:color="CBD8D2" w:sz="1"/>
+            </w:tcBorders>
+            <w:tcMar>
+              <w:top w:type="dxa" w:w="70"/>
+              <w:left w:type="dxa" w:w="95"/>
+              <w:bottom w:type="dxa" w:w="70"/>
+              <w:right w:type="dxa" w:w="95"/>
+            </w:tcMar>
+            <w:vAlign w:val="top"/>
+          </w:tcPr>
+          <w:p>
+            <w:pPr>
+              <w:spacing w:after="0" w:before="0" w:line="252"/>
+            </w:pPr>
+            <w:r>
+              <w:rPr>
+                <w:rFonts w:ascii="Arial" w:cs="Arial" w:eastAsia="Arial" w:hAnsi="Arial"/>
+                <w:b w:val="false"/>
+                <w:bCs w:val="false"/>
+                <w:i w:val="false"/>
+                <w:iCs w:val="false"/>
+                <w:color w:val="17201C"/>
+                <w:sz w:val="19"/>
+                <w:szCs w:val="19"/>
+              </w:rPr>
+              <w:t xml:space="preserve">blank2389473495</w:t>
+            </w:r>
+          </w:p>
+        </w:tc>
+        <w:tc>
+          <w:tcPr>
+            <w:tcW w:type="dxa" w:w="3100"/>
+            <w:tcBorders>
+              <w:top w:val="single" w:color="CBD8D2" w:sz="1"/>
+              <w:left w:val="single" w:color="CBD8D2" w:sz="1"/>
+              <w:bottom w:val="single" w:color="CBD8D2" w:sz="1"/>
+              <w:right w:val="single" w:color="CBD8D2" w:sz="1"/>
+            </w:tcBorders>
+            <w:tcMar>
+              <w:top w:type="dxa" w:w="70"/>
+              <w:left w:type="dxa" w:w="95"/>
+              <w:bottom w:type="dxa" w:w="70"/>
+              <w:right w:type="dxa" w:w="95"/>
+            </w:tcMar>
+            <w:vAlign w:val="top"/>
+          </w:tcPr>
+          <w:p>
+            <w:pPr>
+              <w:spacing w:after="0" w:before="0" w:line="252"/>
+            </w:pPr>
+            <w:r>
+              <w:rPr>
+                <w:rFonts w:ascii="Arial" w:cs="Arial" w:eastAsia="Arial" w:hAnsi="Arial"/>
+                <w:b w:val="false"/>
+                <w:bCs w:val="false"/>
+                <w:i w:val="false"/>
+                <w:iCs w:val="false"/>
+                <w:color w:val="17201C"/>
+                <w:sz w:val="19"/>
+                <w:szCs w:val="19"/>
+              </w:rPr>
+              <w:t xml:space="preserve">Music streaming rank</w:t>
+            </w:r>
+          </w:p>
+        </w:tc>
+        <w:tc>
+          <w:tcPr>
+            <w:tcW w:type="dxa" w:w="1000"/>
+            <w:tcBorders>
+              <w:top w:val="single" w:color="CBD8D2" w:sz="1"/>
+              <w:left w:val="single" w:color="CBD8D2" w:sz="1"/>
+              <w:bottom w:val="single" w:color="CBD8D2" w:sz="1"/>
+              <w:right w:val="single" w:color="CBD8D2" w:sz="1"/>
+            </w:tcBorders>
+            <w:tcMar>
+              <w:top w:type="dxa" w:w="70"/>
+              <w:left w:type="dxa" w:w="95"/>
+              <w:bottom w:type="dxa" w:w="70"/>
+              <w:right w:type="dxa" w:w="95"/>
+            </w:tcMar>
+            <w:vAlign w:val="top"/>
+          </w:tcPr>
+          <w:p>
+            <w:pPr>
+              <w:spacing w:after="0" w:before="0" w:line="252"/>
+            </w:pPr>
+            <w:r>
+              <w:rPr>
+                <w:rFonts w:ascii="Arial" w:cs="Arial" w:eastAsia="Arial" w:hAnsi="Arial"/>
+                <w:b w:val="false"/>
+                <w:bCs w:val="false"/>
+                <w:i w:val="false"/>
+                <w:iCs w:val="false"/>
+                <w:color w:val="17201C"/>
+                <w:sz w:val="19"/>
+                <w:szCs w:val="19"/>
+              </w:rPr>
+              <w:t xml:space="preserve">67</w:t>
+            </w:r>
+          </w:p>
+        </w:tc>
+        <w:tc>
+          <w:tcPr>
+            <w:tcW w:type="dxa" w:w="2670"/>
+            <w:tcBorders>
+              <w:top w:val="single" w:color="CBD8D2" w:sz="1"/>
+              <w:left w:val="single" w:color="CBD8D2" w:sz="1"/>
+              <w:bottom w:val="single" w:color="CBD8D2" w:sz="1"/>
+              <w:right w:val="single" w:color="CBD8D2" w:sz="1"/>
+            </w:tcBorders>
+            <w:tcMar>
+              <w:top w:type="dxa" w:w="70"/>
+              <w:left w:type="dxa" w:w="95"/>
+              <w:bottom w:type="dxa" w:w="70"/>
+              <w:right w:type="dxa" w:w="95"/>
+            </w:tcMar>
+            <w:vAlign w:val="top"/>
+          </w:tcPr>
+          <w:p>
+            <w:pPr>
+              <w:spacing w:after="0" w:before="0" w:line="252"/>
+            </w:pPr>
+            <w:r>
+              <w:rPr>
+                <w:rFonts w:ascii="Arial" w:cs="Arial" w:eastAsia="Arial" w:hAnsi="Arial"/>
+                <w:b w:val="false"/>
+                <w:bCs w:val="false"/>
+                <w:i w:val="false"/>
+                <w:iCs w:val="false"/>
+                <w:color w:val="17201C"/>
+                <w:sz w:val="19"/>
+                <w:szCs w:val="19"/>
+              </w:rPr>
+              <w:t xml:space="preserve">—</w:t>
             </w:r>
           </w:p>
         </w:tc>
@@ -3109,7 +3723,7 @@
       <w:tr>
         <w:tc>
           <w:tcPr>
-            <w:tcW w:type="dxa" w:w="2200"/>
+            <w:tcW w:type="dxa" w:w="650"/>
             <w:tcBorders>
               <w:top w:val="single" w:color="CBD8D2" w:sz="1"/>
               <w:left w:val="single" w:color="CBD8D2" w:sz="1"/>
@@ -3140,13 +3754,13 @@
                 <w:sz w:val="19"/>
                 <w:szCs w:val="19"/>
               </w:rPr>
-              <w:t xml:space="preserve">4. Ranking and methodology</w:t>
-            </w:r>
-          </w:p>
-        </w:tc>
-        <w:tc>
-          <w:tcPr>
-            <w:tcW w:type="dxa" w:w="5700"/>
+              <w:t xml:space="preserve">4</w:t>
+            </w:r>
+          </w:p>
+        </w:tc>
+        <w:tc>
+          <w:tcPr>
+            <w:tcW w:type="dxa" w:w="3300"/>
             <w:tcBorders>
               <w:top w:val="single" w:color="CBD8D2" w:sz="1"/>
               <w:left w:val="single" w:color="CBD8D2" w:sz="1"/>
@@ -3177,13 +3791,13 @@
                 <w:sz w:val="19"/>
                 <w:szCs w:val="19"/>
               </w:rPr>
-              <w:t xml:space="preserve">Priority is qualitative and auditable: paired Spotify view, size anomaly, production-access logic.</w:t>
-            </w:r>
-          </w:p>
-        </w:tc>
-        <w:tc>
-          <w:tcPr>
-            <w:tcW w:type="dxa" w:w="2820"/>
+              <w:t xml:space="preserve">SaylorMoon</w:t>
+            </w:r>
+          </w:p>
+        </w:tc>
+        <w:tc>
+          <w:tcPr>
+            <w:tcW w:type="dxa" w:w="3100"/>
             <w:tcBorders>
               <w:top w:val="single" w:color="CBD8D2" w:sz="1"/>
               <w:left w:val="single" w:color="CBD8D2" w:sz="1"/>
@@ -3214,7 +3828,450 @@
                 <w:sz w:val="19"/>
                 <w:szCs w:val="19"/>
               </w:rPr>
-              <w:t xml:space="preserve">Support files available on request.</w:t>
+              <w:t xml:space="preserve">Music streaming rank</w:t>
+            </w:r>
+          </w:p>
+        </w:tc>
+        <w:tc>
+          <w:tcPr>
+            <w:tcW w:type="dxa" w:w="1000"/>
+            <w:tcBorders>
+              <w:top w:val="single" w:color="CBD8D2" w:sz="1"/>
+              <w:left w:val="single" w:color="CBD8D2" w:sz="1"/>
+              <w:bottom w:val="single" w:color="CBD8D2" w:sz="1"/>
+              <w:right w:val="single" w:color="CBD8D2" w:sz="1"/>
+            </w:tcBorders>
+            <w:shd w:fill="F4F7F2" w:val="clear"/>
+            <w:tcMar>
+              <w:top w:type="dxa" w:w="70"/>
+              <w:left w:type="dxa" w:w="95"/>
+              <w:bottom w:type="dxa" w:w="70"/>
+              <w:right w:type="dxa" w:w="95"/>
+            </w:tcMar>
+            <w:vAlign w:val="top"/>
+          </w:tcPr>
+          <w:p>
+            <w:pPr>
+              <w:spacing w:after="0" w:before="0" w:line="252"/>
+            </w:pPr>
+            <w:r>
+              <w:rPr>
+                <w:rFonts w:ascii="Arial" w:cs="Arial" w:eastAsia="Arial" w:hAnsi="Arial"/>
+                <w:b w:val="false"/>
+                <w:bCs w:val="false"/>
+                <w:i w:val="false"/>
+                <w:iCs w:val="false"/>
+                <w:color w:val="17201C"/>
+                <w:sz w:val="19"/>
+                <w:szCs w:val="19"/>
+              </w:rPr>
+              <w:t xml:space="preserve">53</w:t>
+            </w:r>
+          </w:p>
+        </w:tc>
+        <w:tc>
+          <w:tcPr>
+            <w:tcW w:type="dxa" w:w="2670"/>
+            <w:tcBorders>
+              <w:top w:val="single" w:color="CBD8D2" w:sz="1"/>
+              <w:left w:val="single" w:color="CBD8D2" w:sz="1"/>
+              <w:bottom w:val="single" w:color="CBD8D2" w:sz="1"/>
+              <w:right w:val="single" w:color="CBD8D2" w:sz="1"/>
+            </w:tcBorders>
+            <w:shd w:fill="F4F7F2" w:val="clear"/>
+            <w:tcMar>
+              <w:top w:type="dxa" w:w="70"/>
+              <w:left w:type="dxa" w:w="95"/>
+              <w:bottom w:type="dxa" w:w="70"/>
+              <w:right w:type="dxa" w:w="95"/>
+            </w:tcMar>
+            <w:vAlign w:val="top"/>
+          </w:tcPr>
+          <w:p>
+            <w:pPr>
+              <w:spacing w:after="0" w:before="0" w:line="252"/>
+            </w:pPr>
+            <w:r>
+              <w:rPr>
+                <w:rFonts w:ascii="Arial" w:cs="Arial" w:eastAsia="Arial" w:hAnsi="Arial"/>
+                <w:b w:val="false"/>
+                <w:bCs w:val="false"/>
+                <w:i w:val="false"/>
+                <w:iCs w:val="false"/>
+                <w:color w:val="17201C"/>
+                <w:sz w:val="19"/>
+                <w:szCs w:val="19"/>
+              </w:rPr>
+              <w:t xml:space="preserve">—</w:t>
+            </w:r>
+          </w:p>
+        </w:tc>
+      </w:tr>
+      <w:tr>
+        <w:tc>
+          <w:tcPr>
+            <w:tcW w:type="dxa" w:w="650"/>
+            <w:tcBorders>
+              <w:top w:val="single" w:color="CBD8D2" w:sz="1"/>
+              <w:left w:val="single" w:color="CBD8D2" w:sz="1"/>
+              <w:bottom w:val="single" w:color="CBD8D2" w:sz="1"/>
+              <w:right w:val="single" w:color="CBD8D2" w:sz="1"/>
+            </w:tcBorders>
+            <w:tcMar>
+              <w:top w:type="dxa" w:w="70"/>
+              <w:left w:type="dxa" w:w="95"/>
+              <w:bottom w:type="dxa" w:w="70"/>
+              <w:right w:type="dxa" w:w="95"/>
+            </w:tcMar>
+            <w:vAlign w:val="top"/>
+          </w:tcPr>
+          <w:p>
+            <w:pPr>
+              <w:spacing w:after="0" w:before="0" w:line="252"/>
+            </w:pPr>
+            <w:r>
+              <w:rPr>
+                <w:rFonts w:ascii="Arial" w:cs="Arial" w:eastAsia="Arial" w:hAnsi="Arial"/>
+                <w:b w:val="false"/>
+                <w:bCs w:val="false"/>
+                <w:i w:val="false"/>
+                <w:iCs w:val="false"/>
+                <w:color w:val="17201C"/>
+                <w:sz w:val="19"/>
+                <w:szCs w:val="19"/>
+              </w:rPr>
+              <w:t xml:space="preserve">5</w:t>
+            </w:r>
+          </w:p>
+        </w:tc>
+        <w:tc>
+          <w:tcPr>
+            <w:tcW w:type="dxa" w:w="3300"/>
+            <w:tcBorders>
+              <w:top w:val="single" w:color="CBD8D2" w:sz="1"/>
+              <w:left w:val="single" w:color="CBD8D2" w:sz="1"/>
+              <w:bottom w:val="single" w:color="CBD8D2" w:sz="1"/>
+              <w:right w:val="single" w:color="CBD8D2" w:sz="1"/>
+            </w:tcBorders>
+            <w:tcMar>
+              <w:top w:type="dxa" w:w="70"/>
+              <w:left w:type="dxa" w:w="95"/>
+              <w:bottom w:type="dxa" w:w="70"/>
+              <w:right w:type="dxa" w:w="95"/>
+            </w:tcMar>
+            <w:vAlign w:val="top"/>
+          </w:tcPr>
+          <w:p>
+            <w:pPr>
+              <w:spacing w:after="0" w:before="0" w:line="252"/>
+            </w:pPr>
+            <w:r>
+              <w:rPr>
+                <w:rFonts w:ascii="Arial" w:cs="Arial" w:eastAsia="Arial" w:hAnsi="Arial"/>
+                <w:b w:val="false"/>
+                <w:bCs w:val="false"/>
+                <w:i w:val="false"/>
+                <w:iCs w:val="false"/>
+                <w:color w:val="17201C"/>
+                <w:sz w:val="19"/>
+                <w:szCs w:val="19"/>
+              </w:rPr>
+              <w:t xml:space="preserve">AllYourMoniesAreBelongToMe</w:t>
+            </w:r>
+          </w:p>
+        </w:tc>
+        <w:tc>
+          <w:tcPr>
+            <w:tcW w:type="dxa" w:w="3100"/>
+            <w:tcBorders>
+              <w:top w:val="single" w:color="CBD8D2" w:sz="1"/>
+              <w:left w:val="single" w:color="CBD8D2" w:sz="1"/>
+              <w:bottom w:val="single" w:color="CBD8D2" w:sz="1"/>
+              <w:right w:val="single" w:color="CBD8D2" w:sz="1"/>
+            </w:tcBorders>
+            <w:tcMar>
+              <w:top w:type="dxa" w:w="70"/>
+              <w:left w:type="dxa" w:w="95"/>
+              <w:bottom w:type="dxa" w:w="70"/>
+              <w:right w:type="dxa" w:w="95"/>
+            </w:tcMar>
+            <w:vAlign w:val="top"/>
+          </w:tcPr>
+          <w:p>
+            <w:pPr>
+              <w:spacing w:after="0" w:before="0" w:line="252"/>
+            </w:pPr>
+            <w:r>
+              <w:rPr>
+                <w:rFonts w:ascii="Arial" w:cs="Arial" w:eastAsia="Arial" w:hAnsi="Arial"/>
+                <w:b w:val="false"/>
+                <w:bCs w:val="false"/>
+                <w:i w:val="false"/>
+                <w:iCs w:val="false"/>
+                <w:color w:val="17201C"/>
+                <w:sz w:val="19"/>
+                <w:szCs w:val="19"/>
+              </w:rPr>
+              <w:t xml:space="preserve">Entertainment release</w:t>
+            </w:r>
+          </w:p>
+        </w:tc>
+        <w:tc>
+          <w:tcPr>
+            <w:tcW w:type="dxa" w:w="1000"/>
+            <w:tcBorders>
+              <w:top w:val="single" w:color="CBD8D2" w:sz="1"/>
+              <w:left w:val="single" w:color="CBD8D2" w:sz="1"/>
+              <w:bottom w:val="single" w:color="CBD8D2" w:sz="1"/>
+              <w:right w:val="single" w:color="CBD8D2" w:sz="1"/>
+            </w:tcBorders>
+            <w:tcMar>
+              <w:top w:type="dxa" w:w="70"/>
+              <w:left w:type="dxa" w:w="95"/>
+              <w:bottom w:type="dxa" w:w="70"/>
+              <w:right w:type="dxa" w:w="95"/>
+            </w:tcMar>
+            <w:vAlign w:val="top"/>
+          </w:tcPr>
+          <w:p>
+            <w:pPr>
+              <w:spacing w:after="0" w:before="0" w:line="252"/>
+            </w:pPr>
+            <w:r>
+              <w:rPr>
+                <w:rFonts w:ascii="Arial" w:cs="Arial" w:eastAsia="Arial" w:hAnsi="Arial"/>
+                <w:b w:val="false"/>
+                <w:bCs w:val="false"/>
+                <w:i w:val="false"/>
+                <w:iCs w:val="false"/>
+                <w:color w:val="17201C"/>
+                <w:sz w:val="19"/>
+                <w:szCs w:val="19"/>
+              </w:rPr>
+              <w:t xml:space="preserve">52</w:t>
+            </w:r>
+          </w:p>
+        </w:tc>
+        <w:tc>
+          <w:tcPr>
+            <w:tcW w:type="dxa" w:w="2670"/>
+            <w:tcBorders>
+              <w:top w:val="single" w:color="CBD8D2" w:sz="1"/>
+              <w:left w:val="single" w:color="CBD8D2" w:sz="1"/>
+              <w:bottom w:val="single" w:color="CBD8D2" w:sz="1"/>
+              <w:right w:val="single" w:color="CBD8D2" w:sz="1"/>
+            </w:tcBorders>
+            <w:tcMar>
+              <w:top w:type="dxa" w:w="70"/>
+              <w:left w:type="dxa" w:w="95"/>
+              <w:bottom w:type="dxa" w:w="70"/>
+              <w:right w:type="dxa" w:w="95"/>
+            </w:tcMar>
+            <w:vAlign w:val="top"/>
+          </w:tcPr>
+          <w:p>
+            <w:pPr>
+              <w:spacing w:after="0" w:before="0" w:line="252"/>
+            </w:pPr>
+            <w:r>
+              <w:rPr>
+                <w:rFonts w:ascii="Arial" w:cs="Arial" w:eastAsia="Arial" w:hAnsi="Arial"/>
+                <w:b w:val="false"/>
+                <w:bCs w:val="false"/>
+                <w:i w:val="false"/>
+                <w:iCs w:val="false"/>
+                <w:color w:val="17201C"/>
+                <w:sz w:val="19"/>
+                <w:szCs w:val="19"/>
+              </w:rPr>
+              <w:t xml:space="preserve">Yes</w:t>
+            </w:r>
+          </w:p>
+        </w:tc>
+      </w:tr>
+      <w:tr>
+        <w:tc>
+          <w:tcPr>
+            <w:tcW w:type="dxa" w:w="650"/>
+            <w:tcBorders>
+              <w:top w:val="single" w:color="CBD8D2" w:sz="1"/>
+              <w:left w:val="single" w:color="CBD8D2" w:sz="1"/>
+              <w:bottom w:val="single" w:color="CBD8D2" w:sz="1"/>
+              <w:right w:val="single" w:color="CBD8D2" w:sz="1"/>
+            </w:tcBorders>
+            <w:shd w:fill="F4F7F2" w:val="clear"/>
+            <w:tcMar>
+              <w:top w:type="dxa" w:w="70"/>
+              <w:left w:type="dxa" w:w="95"/>
+              <w:bottom w:type="dxa" w:w="70"/>
+              <w:right w:type="dxa" w:w="95"/>
+            </w:tcMar>
+            <w:vAlign w:val="top"/>
+          </w:tcPr>
+          <w:p>
+            <w:pPr>
+              <w:spacing w:after="0" w:before="0" w:line="252"/>
+            </w:pPr>
+            <w:r>
+              <w:rPr>
+                <w:rFonts w:ascii="Arial" w:cs="Arial" w:eastAsia="Arial" w:hAnsi="Arial"/>
+                <w:b w:val="false"/>
+                <w:bCs w:val="false"/>
+                <w:i w:val="false"/>
+                <w:iCs w:val="false"/>
+                <w:color w:val="17201C"/>
+                <w:sz w:val="19"/>
+                <w:szCs w:val="19"/>
+              </w:rPr>
+              <w:t xml:space="preserve">6</w:t>
+            </w:r>
+          </w:p>
+        </w:tc>
+        <w:tc>
+          <w:tcPr>
+            <w:tcW w:type="dxa" w:w="3300"/>
+            <w:tcBorders>
+              <w:top w:val="single" w:color="CBD8D2" w:sz="1"/>
+              <w:left w:val="single" w:color="CBD8D2" w:sz="1"/>
+              <w:bottom w:val="single" w:color="CBD8D2" w:sz="1"/>
+              <w:right w:val="single" w:color="CBD8D2" w:sz="1"/>
+            </w:tcBorders>
+            <w:shd w:fill="F4F7F2" w:val="clear"/>
+            <w:tcMar>
+              <w:top w:type="dxa" w:w="70"/>
+              <w:left w:type="dxa" w:w="95"/>
+              <w:bottom w:type="dxa" w:w="70"/>
+              <w:right w:type="dxa" w:w="95"/>
+            </w:tcMar>
+            <w:vAlign w:val="top"/>
+          </w:tcPr>
+          <w:p>
+            <w:pPr>
+              <w:spacing w:after="0" w:before="0" w:line="252"/>
+            </w:pPr>
+            <w:r>
+              <w:rPr>
+                <w:rFonts w:ascii="Arial" w:cs="Arial" w:eastAsia="Arial" w:hAnsi="Arial"/>
+                <w:b w:val="false"/>
+                <w:bCs w:val="false"/>
+                <w:i w:val="false"/>
+                <w:iCs w:val="false"/>
+                <w:color w:val="17201C"/>
+                <w:sz w:val="19"/>
+                <w:szCs w:val="19"/>
+              </w:rPr>
+              <w:t xml:space="preserve">BeN</w:t>
+            </w:r>
+          </w:p>
+        </w:tc>
+        <w:tc>
+          <w:tcPr>
+            <w:tcW w:type="dxa" w:w="3100"/>
+            <w:tcBorders>
+              <w:top w:val="single" w:color="CBD8D2" w:sz="1"/>
+              <w:left w:val="single" w:color="CBD8D2" w:sz="1"/>
+              <w:bottom w:val="single" w:color="CBD8D2" w:sz="1"/>
+              <w:right w:val="single" w:color="CBD8D2" w:sz="1"/>
+            </w:tcBorders>
+            <w:shd w:fill="F4F7F2" w:val="clear"/>
+            <w:tcMar>
+              <w:top w:type="dxa" w:w="70"/>
+              <w:left w:type="dxa" w:w="95"/>
+              <w:bottom w:type="dxa" w:w="70"/>
+              <w:right w:type="dxa" w:w="95"/>
+            </w:tcMar>
+            <w:vAlign w:val="top"/>
+          </w:tcPr>
+          <w:p>
+            <w:pPr>
+              <w:spacing w:after="0" w:before="0" w:line="252"/>
+            </w:pPr>
+            <w:r>
+              <w:rPr>
+                <w:rFonts w:ascii="Arial" w:cs="Arial" w:eastAsia="Arial" w:hAnsi="Arial"/>
+                <w:b w:val="false"/>
+                <w:bCs w:val="false"/>
+                <w:i w:val="false"/>
+                <w:iCs w:val="false"/>
+                <w:color w:val="17201C"/>
+                <w:sz w:val="19"/>
+                <w:szCs w:val="19"/>
+              </w:rPr>
+              <w:t xml:space="preserve">Music streaming rank</w:t>
+            </w:r>
+          </w:p>
+        </w:tc>
+        <w:tc>
+          <w:tcPr>
+            <w:tcW w:type="dxa" w:w="1000"/>
+            <w:tcBorders>
+              <w:top w:val="single" w:color="CBD8D2" w:sz="1"/>
+              <w:left w:val="single" w:color="CBD8D2" w:sz="1"/>
+              <w:bottom w:val="single" w:color="CBD8D2" w:sz="1"/>
+              <w:right w:val="single" w:color="CBD8D2" w:sz="1"/>
+            </w:tcBorders>
+            <w:shd w:fill="F4F7F2" w:val="clear"/>
+            <w:tcMar>
+              <w:top w:type="dxa" w:w="70"/>
+              <w:left w:type="dxa" w:w="95"/>
+              <w:bottom w:type="dxa" w:w="70"/>
+              <w:right w:type="dxa" w:w="95"/>
+            </w:tcMar>
+            <w:vAlign w:val="top"/>
+          </w:tcPr>
+          <w:p>
+            <w:pPr>
+              <w:spacing w:after="0" w:before="0" w:line="252"/>
+            </w:pPr>
+            <w:r>
+              <w:rPr>
+                <w:rFonts w:ascii="Arial" w:cs="Arial" w:eastAsia="Arial" w:hAnsi="Arial"/>
+                <w:b w:val="false"/>
+                <w:bCs w:val="false"/>
+                <w:i w:val="false"/>
+                <w:iCs w:val="false"/>
+                <w:color w:val="17201C"/>
+                <w:sz w:val="19"/>
+                <w:szCs w:val="19"/>
+              </w:rPr>
+              <w:t xml:space="preserve">51</w:t>
+            </w:r>
+          </w:p>
+        </w:tc>
+        <w:tc>
+          <w:tcPr>
+            <w:tcW w:type="dxa" w:w="2670"/>
+            <w:tcBorders>
+              <w:top w:val="single" w:color="CBD8D2" w:sz="1"/>
+              <w:left w:val="single" w:color="CBD8D2" w:sz="1"/>
+              <w:bottom w:val="single" w:color="CBD8D2" w:sz="1"/>
+              <w:right w:val="single" w:color="CBD8D2" w:sz="1"/>
+            </w:tcBorders>
+            <w:shd w:fill="F4F7F2" w:val="clear"/>
+            <w:tcMar>
+              <w:top w:type="dxa" w:w="70"/>
+              <w:left w:type="dxa" w:w="95"/>
+              <w:bottom w:type="dxa" w:w="70"/>
+              <w:right w:type="dxa" w:w="95"/>
+            </w:tcMar>
+            <w:vAlign w:val="top"/>
+          </w:tcPr>
+          <w:p>
+            <w:pPr>
+              <w:spacing w:after="0" w:before="0" w:line="252"/>
+            </w:pPr>
+            <w:r>
+              <w:rPr>
+                <w:rFonts w:ascii="Arial" w:cs="Arial" w:eastAsia="Arial" w:hAnsi="Arial"/>
+                <w:b w:val="false"/>
+                <w:bCs w:val="false"/>
+                <w:i w:val="false"/>
+                <w:iCs w:val="false"/>
+                <w:color w:val="17201C"/>
+                <w:sz w:val="19"/>
+                <w:szCs w:val="19"/>
+              </w:rPr>
+              <w:t xml:space="preserve">—</w:t>
             </w:r>
           </w:p>
         </w:tc>
@@ -3222,7 +4279,7 @@
     </w:tbl>
     <w:p>
       <w:pPr>
-        <w:spacing w:after="0" w:before="0" w:line="252"/>
+        <w:spacing w:after="90" w:before="60" w:line="252"/>
       </w:pPr>
       <w:r>
         <w:rPr>
@@ -3235,7 +4292,38 @@
           <w:sz w:val="19"/>
           <w:szCs w:val="19"/>
         </w:rPr>
-        <w:t xml:space="preserve">If supporting files are requested, send the small artifact package rather than the full working repository. The support package contains the reviewed market set, candidate lead queue, contract movement outputs, chart images, and reproduction scripts.</w:t>
+        <w:t xml:space="preserve">The three profiled here, Kevindoto, ScottyNooo, and AllYourMonies, sit at ranks 1, 2, and 5. The queue holds more, a music-rank wallet at #3 and others below, left as live follow-ups. One pattern outlasts any single name: Kevindoto, blank2389473495, and BeN all bought into the same Weeknd and Drake Spotify-rank markets, a cluster that warrants a coordination check on its own.</w:t>
+      </w:r>
+    </w:p>
+    <w:p>
+      <w:pPr>
+        <w:spacing w:after="0" w:before="120" w:line="252"/>
+      </w:pPr>
+      <w:r>
+        <w:rPr>
+          <w:rFonts w:ascii="Arial" w:cs="Arial" w:eastAsia="Arial" w:hAnsi="Arial"/>
+          <w:b/>
+          <w:bCs/>
+          <w:i w:val="false"/>
+          <w:iCs w:val="false"/>
+          <w:color w:val="17201C"/>
+          <w:sz w:val="19"/>
+          <w:szCs w:val="19"/>
+        </w:rPr>
+        <w:t xml:space="preserve">Support package: </w:t>
+      </w:r>
+      <w:r>
+        <w:rPr>
+          <w:rFonts w:ascii="Arial" w:cs="Arial" w:eastAsia="Arial" w:hAnsi="Arial"/>
+          <w:b w:val="false"/>
+          <w:bCs w:val="false"/>
+          <w:i w:val="false"/>
+          <w:iCs w:val="false"/>
+          <w:color w:val="17201C"/>
+          <w:sz w:val="19"/>
+          <w:szCs w:val="19"/>
+        </w:rPr>
+        <w:t xml:space="preserve">code and CSV artifacts, the reviewed market set, the ranked candidate lead queue, contract-movement outputs, and chart images, available on request rather than as the full working repository.</w:t>
       </w:r>
     </w:p>
     <w:sectPr>
@@ -3412,8 +4500,26 @@
       </w:pPr>
     </w:lvl>
   </w:abstractNum>
+  <w:abstractNum w:abstractNumId="2" w15:restartNumberingAfterBreak="0">
+    <w:multiLevelType w:val="hybridMultilevel"/>
+    <w:lvl w:ilvl="0" w15:tentative="1">
+      <w:start w:val="1"/>
+      <w:numFmt w:val="bullet"/>
+      <w:lvlText w:val="•"/>
+      <w:lvlJc w:val="left"/>
+      <w:pPr>
+        <w:ind w:left="460" w:hanging="240"/>
+      </w:pPr>
+    </w:lvl>
+  </w:abstractNum>
   <w:num w:numId="1">
     <w:abstractNumId w:val="1"/>
+    <w:lvlOverride w:ilvl="0">
+      <w:startOverride w:val="1"/>
+    </w:lvlOverride>
+  </w:num>
+  <w:num w:numId="2">
+    <w:abstractNumId w:val="2"/>
     <w:lvlOverride w:ilvl="0">
       <w:startOverride w:val="1"/>
     </w:lvlOverride>

</xml_diff>

<commit_message>
Add wallet-relative size anomaly (vs lifetime median) to lead queue and memo
- identify_candidate_leads.py: add lifetime_median_size_usd + notional_vs_lifetime_median
- Memo: ScottyNooo profiled with ~330x its $27 median (sizing up on the less-likely side)
- Heuristics row reflects 100x-330x size jumps

Co-Authored-By: Claude Opus 4.7 <noreply@anthropic.com>
</commit_message>
<xml_diff>
--- a/report/Inca_Polymarket_Submission_Memo.docx
+++ b/report/Inca_Polymarket_Submission_Memo.docx
@@ -614,7 +614,7 @@
                 <w:sz w:val="19"/>
                 <w:szCs w:val="19"/>
               </w:rPr>
-              <w:t xml:space="preserve">Paired Spotify view, a 116x size jump, and an early awards bet.</w:t>
+              <w:t xml:space="preserve">Bets 100x to 330x a wallet's usual trade size, plus a paired Spotify view.</w:t>
             </w:r>
           </w:p>
         </w:tc>
@@ -2588,7 +2588,7 @@
           <w:sz w:val="19"/>
           <w:szCs w:val="19"/>
         </w:rPr>
-        <w:t xml:space="preserve">bet $9.2k that Lady Gaga would not win three Grammys, at 43c, four days before the night resolved exactly that way. Awards markets leak through the people who decide them, voters, academy staff, publicists. Betting against a specific count, not just a win, is a finer read than the public had, and the contract swung down to 12c before settling NO.</w:t>
+        <w:t xml:space="preserve">normally trades about $27. It put $9.2k on Lady Gaga not winning three Grammys, roughly 330 times its own median, at 43c and against the market's lean, four days before the night resolved that way. A wallet sizing up that hard on the less-likely side is the behavioral tell. Awards leak through the people who decide them, voters, academy staff, publicists, and betting a specific count rather than a plain win is a finer read than the public had. The contract swung to 12c before settling NO.</w:t>
       </w:r>
     </w:p>
     <w:p>

</xml_diff>